<commit_message>
Limit bibliography to nine peer-reviewed sources with accessible links
Drops books and non-academic sources, replaces the 2017 OJJDP report
with the 2023 peer-reviewed update, adds the Hebrew version of the
Hadar and Gal study and the Fulham et al. meta-analysis, and updates
in-text citations accordingly.

Co-Authored-By: Claude Fable 5.1 <noreply@anthropic.com>
Claude-Session: https://claude.ai/code/session_01As7S69NaLZWPi9WH4jd1cV
</commit_message>
<xml_diff>
--- a/papers/restorative-justice-summary-paper.docx
+++ b/papers/restorative-justice-summary-paper.docx
@@ -436,7 +436,7 @@
           <w:sz w:val="24"/>
           <w:szCs w:val="24"/>
         </w:rPr>
-        <w:t>בישראל פועלות בשירות המבחן לנוער שתי תוכניות ממשלתיות: קד"ם (קבוצות דיון משפחתיות) והנ"ף (היוועדות נפגע-פוגע). שתיהן מופעלות באמצעות עמותת קד"ם ומקיימות מאות הליכים בשנה, לצד תוכנית מקבילה בשירות המבחן למבוגרים (עמותת קד"ם, ל.ת.). ההליך אינו תחליף להליך הפלילי אלא משולב בו, ותוצאותיו נשקלות בהחלטה על סגירת התיק או בגזר הדין. בשנים האחרונות מתרחב השימוש בגישה גם לפגיעות מיניות, תחום שנחשב במשך שנים בלתי מתאים לה. מחקר ישראלי שראיין שש-עשרה שורדות אלימות מינית שהשתתפו במפגשי צדק מאחה מצא כי אצל רבות מהן התפתחה "סליחה דיאלוגית": ירידה ברגשות השליליים כלפי הפוגע שצמחה מתוך השיח במפגש, ולא כדרישה שהוצבה מבחוץ (Hadar &amp; Gal, 2023).</w:t>
+        <w:t>בישראל פועלות בשירות המבחן לנוער שתי תוכניות ממשלתיות: קד"ם (קבוצות דיון משפחתיות) והנ"ף (היוועדות נפגע-פוגע). לצידן פועלת תוכנית מקבילה בשירות המבחן למבוגרים. ההליך אינו תחליף להליך הפלילי אלא משולב בו, ותוצאותיו נשקלות בהחלטה על סגירת התיק או בגזר הדין (קלר-חלמיש ופלג-קוריאט, 2020). בשנים האחרונות מתרחב השימוש בגישה גם לפגיעות מיניות, תחום שנחשב במשך שנים בלתי מתאים לה. מחקר ישראלי שראיין שש-עשרה שורדות אלימות מינית שהשתתפו במפגשי צדק מאחה מצא כי אצל רבות מהן התפתחה "סליחה דיאלוגית": ירידה ברגשות השליליים כלפי הפוגע שצמחה מתוך השיח במפגש, ולא כדרישה שהוצבה מבחוץ (הדר וגל, 2023).</w:t>
       </w:r>
     </w:p>
     <w:p>
@@ -453,7 +453,7 @@
           <w:sz w:val="24"/>
           <w:szCs w:val="24"/>
         </w:rPr>
-        <w:t>הראיות הבינלאומיות זהירות יותר. מטא-אנליזה שהזמין משרד המשפטים האמריקני סיכמה 84 הערכות של תוכניות צדק מאחה לנוער ומצאה ירידה בעבריינות חוזרת ושיפור בשביעות רצון הנפגעים, אך ההשפעות היו צנועות והמחברים סייגו את מסקנותיהם בשל האיכות המשתנה של המחקרים (Wilson et al., 2017).</w:t>
+        <w:t>הראיות הבינלאומיות זהירות יותר. מטא-אנליזה מעודכנת של 79 הערכות של תוכניות צדק מאחה לנוער מצאה ירידה קטנה עד בינונית בעבריינות חוזרת, לצד עלייה ניכרת בתחושת ההגינות ובשביעות הרצון של הנפגעים ושל הנערים (Kimbrell et al., 2023). מטא-אנליזה נוספת, שכללה גם תוכניות למבוגרים, מצאה ירידה מובהקת אך קטנה בעבריינות חוזרת כללית, וללא השפעה על עבריינות אלימה חוזרת (Fulham et al., 2025).</w:t>
       </w:r>
     </w:p>
     <w:p>
@@ -470,28 +470,7 @@
           <w:sz w:val="24"/>
           <w:szCs w:val="24"/>
         </w:rPr>
-        <w:t xml:space="preserve">ההיבט הרב-תרבותי בולט בישראל במיוחד. בחברה הערבית פועל מנגנון מסורתי מקביל, הסולחה, שבו נכבדים מתווכים בין משפחות הפוגע והנפגע עד לטקס פיוס פומבי המשיב לנפגע את כבודו ומסמן את סיום מעגל האלימות (Pely, 2016: </w:t>
-      </w:r>
-      <w:r>
-        <w:rPr>
-          <w:rFonts w:ascii="David" w:hAnsi="David" w:cs="David" w:eastAsia="David"/>
-          <w:b w:val="0"/>
-          <w:i w:val="0"/>
-          <w:sz w:val="24"/>
-          <w:szCs w:val="24"/>
-          <w:highlight w:val="yellow"/>
-        </w:rPr>
-        <w:t>[עמ']</w:t>
-      </w:r>
-      <w:r>
-        <w:rPr>
-          <w:rFonts w:ascii="David" w:hAnsi="David" w:cs="David" w:eastAsia="David"/>
-          <w:b w:val="0"/>
-          <w:i w:val="0"/>
-          <w:sz w:val="24"/>
-          <w:szCs w:val="24"/>
-        </w:rPr>
-        <w:t>). ההבדל התרבותי ניכר גם בעמדות הציבור: במחקר ישראלי עדכני תפסו משתתפים יהודים פגיעה מינית בתוך המשפחה כחמורה יותר מפגיעה מחוץ לה ותמכו פחות בצדק מאחה במקרים אלה, ואילו משתתפים ערבים לא הבחינו בין שני סוגי הפגיעה, ותמיכתם בהליך הושפעה פחות מחומרת העבירה (Peleg-Koriat, 2025).</w:t>
+        <w:t>ההיבט הרב-תרבותי בולט בישראל במיוחד, והוא ניכר בעמדות הציבור. במחקר ישראלי עדכני תפסו משתתפים יהודים פגיעה מינית בתוך המשפחה כחמורה יותר מפגיעה מחוץ לה ותמכו פחות בצדק מאחה במקרים אלה, ואילו משתתפים ערבים לא הבחינו בין שני סוגי הפגיעה, ותמיכתם בהליך הושפעה פחות מחומרת העבירה (Peleg-Koriat, 2025).</w:t>
       </w:r>
     </w:p>
     <w:p>
@@ -554,7 +533,7 @@
           <w:sz w:val="24"/>
           <w:szCs w:val="24"/>
         </w:rPr>
-        <w:t>צדק מאחה נולד מתוך ביקורת זו. בריית'ווייט הבחין בין בִּיוּש מתייג, המגנה את האדם ומרחיק אותו, לבין ביוש משלב, המגנה את המעשה בלבד ומסתיים במחוות של קבלה מחדש וסליחה (Braithwaite, 1989, כפי שמצוטט אצל Bernburg, 2019). המפגש המאחה הוא הגלמה מוסדית של הביוש המשלב: הפוגע עומד מול הנזק בנוכחות אנשים שחשובים לו, מקבל אחריות, ומתקבל בחזרה לקהילה בתום ההליך. בקד"ם המשפחה המורחבת היא הקהילה המביישת והמשלבת גם יחד, ותוצאה מוצלחת מאפשרת סגירת תיק ללא רישום פלילי, כלומר עצירה של המעבר מעבריינות ראשונית למשנית. הממצאים המתונים של המטא-אנליזה מתיישבים עם ההסבר: ההשפעה על עבריינות חוזרת קיימת, אך היא תלויה באיכות המפגש ובמידה שבה הקהילה אכן מקבלת את הנער בחזרה (Wilson et al., 2017).</w:t>
+        <w:t>צדק מאחה נולד מתוך ביקורת זו. בריית'ווייט הבחין בין בִּיוּש מתייג, המגנה את האדם ומרחיק אותו, לבין ביוש משלב, המגנה את המעשה בלבד ומסתיים במחוות של קבלה מחדש וסליחה (Braithwaite, 1989, כפי שמצוטט אצל Bernburg, 2019). המפגש המאחה הוא הגלמה מוסדית של הביוש המשלב: הפוגע עומד מול הנזק בנוכחות אנשים שחשובים לו, מקבל אחריות, ומתקבל בחזרה לקהילה בתום ההליך. בקד"ם המשפחה המורחבת היא הקהילה המביישת והמשלבת גם יחד, ותוצאה מוצלחת מאפשרת סגירת תיק ללא רישום פלילי, כלומר עצירה של המעבר מעבריינות ראשונית למשנית. הממצאים המתונים של המטא-אנליזה מתיישבים עם ההסבר: ההשפעה על עבריינות חוזרת קיימת, אך היא תלויה באיכות המפגש ובמידה שבה הקהילה אכן מקבלת את הנער בחזרה (Kimbrell et al., 2023).</w:t>
       </w:r>
     </w:p>
     <w:p>
@@ -616,7 +595,7 @@
           <w:sz w:val="24"/>
           <w:szCs w:val="24"/>
         </w:rPr>
-        <w:t>מחאת #MeToo שינתה את המאזן. קלר-חלמיש ופלג-קוריאט (2020) טוענות כי המחאה חשפה את היקף הפגיעות ואת כישלונו של ההליך הפלילי לתת מענה לרובן, ולכן יש להנגיש צדק מאחה לפגיעות מיניות בתנאים מגוננים: השתתפות וולונטרית, הכנה ממושכת, מנחים מיומנים וזכותה של הנפגעת לעצור בכל שלב. ממצאי הראיונות עם השורדות תומכים בעמדה זו. הסליחה, כשהופיעה, לא הייתה תנאי ולא דרישה אלא תוצר של הדיאלוג, ומשתתפות שלא סלחו דיווחו אף הן על הכרה ועל השבת השליטה (Hadar &amp; Gal, 2023). הביקורת הפמיניסטית על "הקורבן האידיאלי", זו שזוכה להכרה רק אם היא תמימה וחסרת אשמה, מהדהדת גם בממצאים על הבדלים אתניים בתמיכה בצדק מאחה: מי נחשב ראוי להליך מאחה ומי לענישה בלבד תלוי בזהות המעורבים, ולא רק במעשה (Peleg-Koriat, 2025).</w:t>
+        <w:t>מחאת #MeToo שינתה את המאזן. קלר-חלמיש ופלג-קוריאט (2020) טוענות כי המחאה חשפה את היקף הפגיעות ואת כישלונו של ההליך הפלילי לתת מענה לרובן, ולכן יש להנגיש צדק מאחה לפגיעות מיניות בתנאים מגוננים: השתתפות וולונטרית, הכנה ממושכת, מנחים מיומנים וזכותה של הנפגעת לעצור בכל שלב. ממצאי הראיונות עם השורדות תומכים בעמדה זו. הסליחה, כשהופיעה, לא הייתה תנאי ולא דרישה אלא תוצר של הדיאלוג, ומשתתפות שלא סלחו דיווחו אף הן על הכרה ועל השבת השליטה (הדר וגל, 2023). הביקורת הפמיניסטית על "הקורבן האידיאלי", זו שזוכה להכרה רק אם היא תמימה וחסרת אשמה, מהדהדת גם בממצאים על הבדלים אתניים בתמיכה בצדק מאחה: מי נחשב ראוי להליך מאחה ומי לענישה בלבד תלוי בזהות המעורבים, ולא רק במעשה (Peleg-Koriat, 2025).</w:t>
       </w:r>
     </w:p>
     <w:p>
@@ -685,7 +664,7 @@
           <w:sz w:val="24"/>
           <w:szCs w:val="24"/>
         </w:rPr>
-        <w:t xml:space="preserve">הפרספקטיבה היהודית על צדק מאחה נלמדה בתואר בשלושה מוקדים: המקרא וספרות חז"ל בקורס </w:t>
+        <w:t xml:space="preserve">הפרספקטיבה היהודית על צדק מאחה נלמדה בתואר בשני מוקדים: המקרא וספרות חז"ל בקורס </w:t>
       </w:r>
       <w:r>
         <w:rPr>
@@ -706,28 +685,7 @@
           <w:sz w:val="24"/>
           <w:szCs w:val="24"/>
         </w:rPr>
-        <w:t xml:space="preserve">, ספרות ההלכה של ימי הביניים בקורס </w:t>
-      </w:r>
-      <w:r>
-        <w:rPr>
-          <w:rFonts w:ascii="David" w:hAnsi="David" w:cs="David" w:eastAsia="David"/>
-          <w:b w:val="0"/>
-          <w:i w:val="0"/>
-          <w:sz w:val="24"/>
-          <w:szCs w:val="24"/>
-          <w:highlight w:val="yellow"/>
-        </w:rPr>
-        <w:t>[שם הקורס]</w:t>
-      </w:r>
-      <w:r>
-        <w:rPr>
-          <w:rFonts w:ascii="David" w:hAnsi="David" w:cs="David" w:eastAsia="David"/>
-          <w:b w:val="0"/>
-          <w:i w:val="0"/>
-          <w:sz w:val="24"/>
-          <w:szCs w:val="24"/>
-        </w:rPr>
-        <w:t xml:space="preserve">, והגות יהודית בת זמננו בקורס </w:t>
+        <w:t xml:space="preserve">, וספרות ההלכה של ימי הביניים ואילך בקורס </w:t>
       </w:r>
       <w:r>
         <w:rPr>
@@ -833,34 +791,6 @@
       <w:r>
         <w:rPr>
           <w:rFonts w:ascii="David" w:hAnsi="David" w:cs="David" w:eastAsia="David"/>
-          <w:b/>
-          <w:i w:val="0"/>
-          <w:sz w:val="24"/>
-          <w:szCs w:val="24"/>
-          <w:bCs/>
-        </w:rPr>
-        <w:t>מקורות בני זמננו.</w:t>
-      </w:r>
-      <w:r>
-        <w:rPr>
-          <w:rFonts w:ascii="David" w:hAnsi="David" w:cs="David" w:eastAsia="David"/>
-          <w:b w:val="0"/>
-          <w:i w:val="0"/>
-          <w:sz w:val="24"/>
-          <w:szCs w:val="24"/>
-        </w:rPr>
-        <w:t xml:space="preserve"> פרישטיק (2019: 23-104) מראה כי הוויקטימולוגיה המודרנית, על אסכולותיה הפוזיטיביסטיות והפוסט-פוזיטיביסטיות, מוצאת במקורות ישראל התייחסות שיטתית לנפגע: לכבודו, לפיצויו ולזכותו להישמע, ולא רק לענישת הפוגע. לטענתו, הדגש היהודי על השבה ועל ריצוי הנפגע קדם בהרבה לעיסוק המחקרי בצרכי הקורבן.</w:t>
-      </w:r>
-    </w:p>
-    <w:p>
-      <w:pPr>
-        <w:spacing w:lineRule="auto" w:line="360" w:after="120" w:before="0"/>
-        <w:jc w:val="both"/>
-        <w:bidi w:val="1"/>
-      </w:pPr>
-      <w:r>
-        <w:rPr>
-          <w:rFonts w:ascii="David" w:hAnsi="David" w:cs="David" w:eastAsia="David"/>
           <w:b w:val="0"/>
           <w:i w:val="0"/>
           <w:sz w:val="24"/>
@@ -918,7 +848,7 @@
           <w:sz w:val="24"/>
           <w:szCs w:val="24"/>
         </w:rPr>
-        <w:t>ההבדל הראשון הוא במעמד הטיעון. הקרימינולוגיה תיאורית ואמפירית, והיא מודדת אם ההליך מפחית עבריינות חוזרת ומיטיב עם הנפגע (Wilson et al., 2017). היהדות נורמטיבית: היא אינה שואלת אם המפגש עובד אלא קובעת שהוא חובה. ההבדל השני, החריף יותר, נוגע לנפגע. הוויקטימולוגיה הפמיניסטית, וכמוה החשיבה הטיפולית העכשווית, עומדות על כך שסליחה אינה יכולה להיות חובה ואינה יכולה לבוא מבחוץ, אלא רק בקצב של הנפגע (אורליק, 2017: 317-339; Hadar &amp; Gal, 2023). ההלכה, לעומת זאת, מכנה סרבן מחילה "אכזרי". הסתירה מתמתנת כשמבחינים בין הליך לעמדה מוסרית: ההלכה אינה כופה מפגש, מתירה לפוגע להניח לנפגע לאחר שלוש פניות, ומכוונת את תביעתה אל תודעת הנפגע ולא אל בית הדין. תרומת הקרימינולוגיה היא הזהירות, כלומר ידע אמפירי על פערי כוח ועל תנאי ההצלחה של המפגש. תרומת היהדות היא התביעה המוסרית: הפוגע חייב לעמוד מול מי שפגע בו, והנפגע אינו רק מושא להגנה אלא סובייקט מוסרי בעל אחריות.</w:t>
+        <w:t>ההבדל הראשון הוא במעמד הטיעון. הקרימינולוגיה תיאורית ואמפירית, והיא מודדת אם ההליך מפחית עבריינות חוזרת ומיטיב עם הנפגע (Kimbrell et al., 2023). היהדות נורמטיבית: היא אינה שואלת אם המפגש עובד אלא קובעת שהוא חובה. ההבדל השני, החריף יותר, נוגע לנפגע. הוויקטימולוגיה הפמיניסטית, וכמוה החשיבה הטיפולית העכשווית, עומדות על כך שסליחה אינה יכולה להיות חובה ואינה יכולה לבוא מבחוץ, אלא רק בקצב של הנפגע (הדר וגל, 2023; Clay-Warner &amp; Edgemon, 2020). ההלכה, לעומת זאת, מכנה סרבן מחילה "אכזרי". הסתירה מתמתנת כשמבחינים בין הליך לעמדה מוסרית: ההלכה אינה כופה מפגש, מתירה לפוגע להניח לנפגע לאחר שלוש פניות, ומכוונת את תביעתה אל תודעת הנפגע ולא אל בית הדין. תרומת הקרימינולוגיה היא הזהירות, כלומר ידע אמפירי על פערי כוח ועל תנאי ההצלחה של המפגש. תרומת היהדות היא התביעה המוסרית: הפוגע חייב לעמוד מול מי שפגע בו, והנפגע אינו רק מושא להגנה אלא סובייקט מוסרי בעל אחריות.</w:t>
       </w:r>
     </w:p>
     <w:p>
@@ -955,43 +885,7 @@
           <w:sz w:val="24"/>
           <w:szCs w:val="24"/>
         </w:rPr>
-        <w:t>אורליק, א' (2017). על תרבות הסליחה כחיונית לפיוס. בתוך א' אורליק, מ' ברגר וא' ברמן (עורכים), קורבניות, נקמה ותרבות הסליחה (עמ' 317-339). אח. https://www.achbooks.co.il/document/50,137,4257.aspx</w:t>
-      </w:r>
-    </w:p>
-    <w:p>
-      <w:pPr>
-        <w:spacing w:lineRule="auto" w:line="360" w:after="160" w:before="0"/>
-        <w:ind w:left="709" w:hanging="709"/>
-        <w:jc w:val="right"/>
-        <w:bidi w:val="1"/>
-      </w:pPr>
-      <w:r>
-        <w:rPr>
-          <w:rFonts w:ascii="David" w:hAnsi="David" w:cs="David" w:eastAsia="David"/>
-          <w:b w:val="0"/>
-          <w:i w:val="0"/>
-          <w:sz w:val="24"/>
-          <w:szCs w:val="24"/>
-        </w:rPr>
-        <w:t>עמותת קד"ם (ל.ת.). תוכנית צדק מאחה לנוער עובר חוק. אוחזר ב-7 בספטמבר, 2026, מתוך https://www.kdm.org.il/for-youth</w:t>
-      </w:r>
-    </w:p>
-    <w:p>
-      <w:pPr>
-        <w:spacing w:lineRule="auto" w:line="360" w:after="160" w:before="0"/>
-        <w:ind w:left="709" w:hanging="709"/>
-        <w:jc w:val="right"/>
-        <w:bidi w:val="1"/>
-      </w:pPr>
-      <w:r>
-        <w:rPr>
-          <w:rFonts w:ascii="David" w:hAnsi="David" w:cs="David" w:eastAsia="David"/>
-          <w:b w:val="0"/>
-          <w:i w:val="0"/>
-          <w:sz w:val="24"/>
-          <w:szCs w:val="24"/>
-        </w:rPr>
-        <w:t>פרישטיק, מ' (2019). ויקטימולוגיה ויהדות: תיאוריה, טיפולוגיה, טיפול, מדיניות ויישום. אח. https://www.achbooks.co.il/document/50,166,4179.aspx</w:t>
+        <w:t>הדר, נ' וגל, ט' (2023). לסלוח או לא לסלוח: סליחה דיאלוגית על פגיעות מיניות בתהליכי צדק מאחה. קרימינולוגיה ישראלית, יא, 87-116. https://cris.haifa.ac.il/en/publications/לסלוח-או-לא-לסלוח-סליחה-דיאלוגית-על-פגיעות-מיניות-בתהליכי-צדק-מאח</w:t>
       </w:r>
     </w:p>
     <w:p>
@@ -1027,7 +921,7 @@
           <w:sz w:val="24"/>
           <w:szCs w:val="24"/>
         </w:rPr>
-        <w:t>Bernburg, J. G. (2019). Labeling theory. In M. D. Krohn, N. Hendrix, G. Penly Hall, &amp; A. J. Lizotte (Eds.), Handbook on crime and deviance (2nd ed., pp. 179-196). Springer. https://doi.org/10.1007/978-3-030-20779-3_10</w:t>
+        <w:t>Bernburg, J. G. (2019). Labeling theory. In M. D. Krohn, N. Hendrix, G. Penly Hall, &amp; A. J. Lizotte (Eds.), Handbook on crime and deviance (2nd ed., pp. 179-196). Springer. https://www.researchgate.net/publication/336312509_LABELING_THEORY</w:t>
       </w:r>
     </w:p>
     <w:p>
@@ -1045,7 +939,7 @@
           <w:sz w:val="24"/>
           <w:szCs w:val="24"/>
         </w:rPr>
-        <w:t>Clay-Warner, J., &amp; Edgemon, T. G. (2020). Feminist approaches to victimology. In S. Walklate, K. Fitz-Gibbon, J. Maher, &amp; J. McCulloch (Eds.), The Emerald handbook of feminism, criminology and social change (pp. 35-50). Emerald Publishing. https://doi.org/10.1108/978-1-78769-955-720201005</w:t>
+        <w:t>Clay-Warner, J., &amp; Edgemon, T. G. (2020). Feminist approaches to victimology. In S. Walklate, K. Fitz-Gibbon, J. Maher, &amp; J. McCulloch (Eds.), The Emerald handbook of feminism, criminology and social change (pp. 35-50). Emerald Publishing. https://research.birmingham.ac.uk/en/publications/feminist-approaches-to-victimology/</w:t>
       </w:r>
     </w:p>
     <w:p>
@@ -1063,7 +957,7 @@
           <w:sz w:val="24"/>
           <w:szCs w:val="24"/>
         </w:rPr>
-        <w:t>Hadar, N., &amp; Gal, T. (2023). Survivors' paths toward forgiveness in restorative justice following sexual violence. Criminal Justice and Behavior, 50(6), 911-928. https://doi.org/10.1177/00938548231162108</w:t>
+        <w:t>Fulham, L., Blais, J., Rugge, T., &amp; Schultheis, E. A. (2025). The effectiveness of restorative justice programs: A meta-analysis of recidivism and other relevant outcomes. Criminology &amp; Criminal Justice, 25(5), 1486-1512. https://doi.org/10.1177/17488958231215228</w:t>
       </w:r>
     </w:p>
     <w:p>
@@ -1081,7 +975,25 @@
           <w:sz w:val="24"/>
           <w:szCs w:val="24"/>
         </w:rPr>
-        <w:t>Peleg-Koriat, I. (2025). Ethnic differences in support for restorative justice in sexual abuse cases: The role of offense severity and malleability beliefs. Violence Against Women. Advance online publication. https://doi.org/10.1177/10778012251347588</w:t>
+        <w:t>Kimbrell, C. S., Wilson, D. B., &amp; Olaghere, A. (2023). Restorative justice programs and practices in juvenile justice: An updated systematic review and meta-analysis for effectiveness. Criminology &amp; Public Policy, 22(1), 161-195. https://doi.org/10.1111/1745-9133.12613</w:t>
+      </w:r>
+    </w:p>
+    <w:p>
+      <w:pPr>
+        <w:spacing w:lineRule="auto" w:line="360" w:after="160" w:before="0"/>
+        <w:ind w:left="709" w:hanging="709"/>
+        <w:jc w:val="left"/>
+        <w:bidi w:val="0"/>
+      </w:pPr>
+      <w:r>
+        <w:rPr>
+          <w:rFonts w:ascii="David" w:hAnsi="David" w:cs="David" w:eastAsia="David"/>
+          <w:b w:val="0"/>
+          <w:i w:val="0"/>
+          <w:sz w:val="24"/>
+          <w:szCs w:val="24"/>
+        </w:rPr>
+        <w:t>Peleg-Koriat, I. (2025). Ethnic differences in support for restorative justice in sexual abuse cases: The role of offense severity and malleability beliefs. Violence Against Women. Advance online publication. https://pmc.ncbi.nlm.nih.gov/articles/PMC13031375/</w:t>
       </w:r>
     </w:p>
     <w:p>
@@ -1117,43 +1029,7 @@
           <w:sz w:val="24"/>
           <w:szCs w:val="24"/>
         </w:rPr>
-        <w:t>Pely, D. (2016). Muslim/Arab mediation and conflict resolution: Understanding sulha. Routledge. https://doi.org/10.4324/9781315644554</w:t>
-      </w:r>
-    </w:p>
-    <w:p>
-      <w:pPr>
-        <w:spacing w:lineRule="auto" w:line="360" w:after="160" w:before="0"/>
-        <w:ind w:left="709" w:hanging="709"/>
-        <w:jc w:val="left"/>
-        <w:bidi w:val="0"/>
-      </w:pPr>
-      <w:r>
-        <w:rPr>
-          <w:rFonts w:ascii="David" w:hAnsi="David" w:cs="David" w:eastAsia="David"/>
-          <w:b w:val="0"/>
-          <w:i w:val="0"/>
-          <w:sz w:val="24"/>
-          <w:szCs w:val="24"/>
-        </w:rPr>
-        <w:t>Van Dijk, J. (2020). Victim labeling theory: A reappraisal. In J. Joseph &amp; S. Jergenson (Eds.), An international perspective on contemporary developments in victimology: A festschrift in honor of Marc Groenhuijsen (pp. 73-90). Springer. https://doi.org/10.1007/978-3-030-41622-5_6</w:t>
-      </w:r>
-    </w:p>
-    <w:p>
-      <w:pPr>
-        <w:spacing w:lineRule="auto" w:line="360" w:after="160" w:before="0"/>
-        <w:ind w:left="709" w:hanging="709"/>
-        <w:jc w:val="left"/>
-        <w:bidi w:val="0"/>
-      </w:pPr>
-      <w:r>
-        <w:rPr>
-          <w:rFonts w:ascii="David" w:hAnsi="David" w:cs="David" w:eastAsia="David"/>
-          <w:b w:val="0"/>
-          <w:i w:val="0"/>
-          <w:sz w:val="24"/>
-          <w:szCs w:val="24"/>
-        </w:rPr>
-        <w:t>Wilson, D. B., Olaghere, A., &amp; Kimbrell, C. S. (2017). Effectiveness of restorative justice principles in juvenile justice: A meta-analysis. Office of Juvenile Justice and Delinquency Prevention, U.S. Department of Justice. https://www.ojp.gov/pdffiles1/ojjdp/grants/250872.pdf</w:t>
+        <w:t>Van Dijk, J. (2020). Victim labeling theory: A reappraisal. In J. Joseph &amp; S. Jergenson (Eds.), An international perspective on contemporary developments in victimology: A festschrift in honor of Marc Groenhuijsen (pp. 73-90). Springer. https://www.researchgate.net/publication/342546073_Victim_Labeling_Theory_A_Reappraisal</w:t>
       </w:r>
     </w:p>
     <w:p>

</xml_diff>

<commit_message>
Add two Hebrew peer-reviewed sources (Hadar & Gal 2023a; Levinstein-Barkai 2020)
Co-Authored-By: Claude Fable 5.1 <noreply@anthropic.com>
Claude-Session: https://claude.ai/code/session_01As7S69NaLZWPi9WH4jd1cV
</commit_message>
<xml_diff>
--- a/papers/restorative-justice-summary-paper.docx
+++ b/papers/restorative-justice-summary-paper.docx
@@ -436,7 +436,7 @@
           <w:sz w:val="24"/>
           <w:szCs w:val="24"/>
         </w:rPr>
-        <w:t>בישראל פועלות בשירות המבחן לנוער שתי תוכניות ממשלתיות: קד"ם (קבוצות דיון משפחתיות) והנ"ף (היוועדות נפגע-פוגע). לצידן פועלת תוכנית מקבילה בשירות המבחן למבוגרים. ההליך אינו תחליף להליך הפלילי אלא משולב בו, ותוצאותיו נשקלות בהחלטה על סגירת התיק או בגזר הדין (קלר-חלמיש ופלג-קוריאט, 2020). בשנים האחרונות מתרחב השימוש בגישה גם לפגיעות מיניות, תחום שנחשב במשך שנים בלתי מתאים לה. מחקר ישראלי שראיין שש-עשרה שורדות אלימות מינית שהשתתפו במפגשי צדק מאחה מצא כי אצל רבות מהן התפתחה "סליחה דיאלוגית": ירידה ברגשות השליליים כלפי הפוגע שצמחה מתוך השיח במפגש, ולא כדרישה שהוצבה מבחוץ (הדר וגל, 2023).</w:t>
+        <w:t>בישראל פועלות בשירות המבחן לנוער שתי תוכניות ממשלתיות: קד"ם (קבוצות דיון משפחתיות) והנ"ף (היוועדות נפגע-פוגע). לצידן פועלת תוכנית מקבילה בשירות המבחן למבוגרים. ההליך אינו תחליף להליך הפלילי אלא משולב בו, ותוצאותיו נשקלות בהחלטה על סגירת התיק או בגזר הדין (קלר-חלמיש ופלג-קוריאט, 2020). בשנים האחרונות מתרחב השימוש בגישה גם לפגיעות מיניות, תחום שנחשב במשך שנים בלתי מתאים לה. מחקר ישראלי שראיין שש-עשרה שורדות אלימות מינית שהשתתפו במפגשי צדק מאחה מצא כי אצל רבות מהן התפתחה "סליחה דיאלוגית": ירידה ברגשות השליליים כלפי הפוגע שצמחה מתוך השיח במפגש, ולא כדרישה שהוצבה מבחוץ (הדר וגל, 2023ב). במאמר נוסף מאותו מחקר תיארו הנפגעות את התקופה שלאחר ההליך כחוויה של איחוי רגשי, וכותרתו לקוחה מדברי אחת המשתתפות על תחושה שתופרים לה את הלב (הדר וגל, 2023א).</w:t>
       </w:r>
     </w:p>
     <w:p>
@@ -595,7 +595,7 @@
           <w:sz w:val="24"/>
           <w:szCs w:val="24"/>
         </w:rPr>
-        <w:t>מחאת #MeToo שינתה את המאזן. קלר-חלמיש ופלג-קוריאט (2020) טוענות כי המחאה חשפה את היקף הפגיעות ואת כישלונו של ההליך הפלילי לתת מענה לרובן, ולכן יש להנגיש צדק מאחה לפגיעות מיניות בתנאים מגוננים: השתתפות וולונטרית, הכנה ממושכת, מנחים מיומנים וזכותה של הנפגעת לעצור בכל שלב. ממצאי הראיונות עם השורדות תומכים בעמדה זו. הסליחה, כשהופיעה, לא הייתה תנאי ולא דרישה אלא תוצר של הדיאלוג, ומשתתפות שלא סלחו דיווחו אף הן על הכרה ועל השבת השליטה (הדר וגל, 2023). הביקורת הפמיניסטית על "הקורבן האידיאלי", זו שזוכה להכרה רק אם היא תמימה וחסרת אשמה, מהדהדת גם בממצאים על הבדלים אתניים בתמיכה בצדק מאחה: מי נחשב ראוי להליך מאחה ומי לענישה בלבד תלוי בזהות המעורבים, ולא רק במעשה (Peleg-Koriat, 2025).</w:t>
+        <w:t>מחאת #MeToo שינתה את המאזן. קלר-חלמיש ופלג-קוריאט (2020) טוענות כי המחאה חשפה את היקף הפגיעות ואת כישלונו של ההליך הפלילי לתת מענה לרובן, ולכן יש להנגיש צדק מאחה לפגיעות מיניות בתנאים מגוננים: השתתפות וולונטרית, הכנה ממושכת, מנחים מיומנים וזכותה של הנפגעת לעצור בכל שלב. ממצאי הראיונות עם השורדות תומכים בעמדה זו. הסליחה, כשהופיעה, לא הייתה תנאי ולא דרישה אלא תוצר של הדיאלוג, ומשתתפות שלא סלחו דיווחו אף הן על הכרה ועל השבת השליטה (הדר וגל, 2023ב). התגובה החברתית לנפגע עצמו ממוגדרת אף היא. ניתוח של 1,890 תגובות גולשים לחשיפות של נפגעי פגיעה מינית במסגרת #MeToo בישראל מצא שנשים זכו לתמיכה רגשית ורשתית רבה יותר מגברים, ואילו גברים קיבלו בעיקר תמיכה הערכתית (לוינשטיין-ברקאי, 2020). מי שאינו תואם את דמות הקורבן המצופה זוכה לפחות הכרה. הביקורת הפמיניסטית על "הקורבן האידיאלי", זו שזוכה להכרה רק אם היא תמימה וחסרת אשמה, מהדהדת גם בממצאים על הבדלים אתניים בתמיכה בצדק מאחה: מי נחשב ראוי להליך מאחה ומי לענישה בלבד תלוי בזהות המעורבים, ולא רק במעשה (Peleg-Koriat, 2025).</w:t>
       </w:r>
     </w:p>
     <w:p>
@@ -848,7 +848,7 @@
           <w:sz w:val="24"/>
           <w:szCs w:val="24"/>
         </w:rPr>
-        <w:t>ההבדל הראשון הוא במעמד הטיעון. הקרימינולוגיה תיאורית ואמפירית, והיא מודדת אם ההליך מפחית עבריינות חוזרת ומיטיב עם הנפגע (Kimbrell et al., 2023). היהדות נורמטיבית: היא אינה שואלת אם המפגש עובד אלא קובעת שהוא חובה. ההבדל השני, החריף יותר, נוגע לנפגע. הוויקטימולוגיה הפמיניסטית, וכמוה החשיבה הטיפולית העכשווית, עומדות על כך שסליחה אינה יכולה להיות חובה ואינה יכולה לבוא מבחוץ, אלא רק בקצב של הנפגע (הדר וגל, 2023; Clay-Warner &amp; Edgemon, 2020). ההלכה, לעומת זאת, מכנה סרבן מחילה "אכזרי". הסתירה מתמתנת כשמבחינים בין הליך לעמדה מוסרית: ההלכה אינה כופה מפגש, מתירה לפוגע להניח לנפגע לאחר שלוש פניות, ומכוונת את תביעתה אל תודעת הנפגע ולא אל בית הדין. תרומת הקרימינולוגיה היא הזהירות, כלומר ידע אמפירי על פערי כוח ועל תנאי ההצלחה של המפגש. תרומת היהדות היא התביעה המוסרית: הפוגע חייב לעמוד מול מי שפגע בו, והנפגע אינו רק מושא להגנה אלא סובייקט מוסרי בעל אחריות.</w:t>
+        <w:t>ההבדל הראשון הוא במעמד הטיעון. הקרימינולוגיה תיאורית ואמפירית, והיא מודדת אם ההליך מפחית עבריינות חוזרת ומיטיב עם הנפגע (Kimbrell et al., 2023). היהדות נורמטיבית: היא אינה שואלת אם המפגש עובד אלא קובעת שהוא חובה. ההבדל השני, החריף יותר, נוגע לנפגע. הוויקטימולוגיה הפמיניסטית, וכמוה החשיבה הטיפולית העכשווית, עומדות על כך שסליחה אינה יכולה להיות חובה ואינה יכולה לבוא מבחוץ, אלא רק בקצב של הנפגע (הדר וגל, 2023ב; Clay-Warner &amp; Edgemon, 2020). ההלכה, לעומת זאת, מכנה סרבן מחילה "אכזרי". הסתירה מתמתנת כשמבחינים בין הליך לעמדה מוסרית: ההלכה אינה כופה מפגש, מתירה לפוגע להניח לנפגע לאחר שלוש פניות, ומכוונת את תביעתה אל תודעת הנפגע ולא אל בית הדין. תרומת הקרימינולוגיה היא הזהירות, כלומר ידע אמפירי על פערי כוח ועל תנאי ההצלחה של המפגש. תרומת היהדות היא התביעה המוסרית: הפוגע חייב לעמוד מול מי שפגע בו, והנפגע אינו רק מושא להגנה אלא סובייקט מוסרי בעל אחריות.</w:t>
       </w:r>
     </w:p>
     <w:p>
@@ -885,7 +885,43 @@
           <w:sz w:val="24"/>
           <w:szCs w:val="24"/>
         </w:rPr>
-        <w:t>הדר, נ' וגל, ט' (2023). לסלוח או לא לסלוח: סליחה דיאלוגית על פגיעות מיניות בתהליכי צדק מאחה. קרימינולוגיה ישראלית, יא, 87-116. https://cris.haifa.ac.il/en/publications/לסלוח-או-לא-לסלוח-סליחה-דיאלוגית-על-פגיעות-מיניות-בתהליכי-צדק-מאח</w:t>
+        <w:t>הדר, נ' וגל, ט' (2023א). "הרגשתי איך תופרים לי את הלב": החוויה הרגשית של נפגעות אלימות מינית בעקבות תהליכי צדק מאחה. חברה ורווחה, מג(3), 355-375. https://www.gov.il/BlobFolder/reports/molsa-43-3-nataly-h/he/SocialAndWelfareMagazine_Magazine-43-3_43-3-NATALY-H.pdf</w:t>
+      </w:r>
+    </w:p>
+    <w:p>
+      <w:pPr>
+        <w:spacing w:lineRule="auto" w:line="360" w:after="160" w:before="0"/>
+        <w:ind w:left="709" w:hanging="709"/>
+        <w:jc w:val="right"/>
+        <w:bidi w:val="1"/>
+      </w:pPr>
+      <w:r>
+        <w:rPr>
+          <w:rFonts w:ascii="David" w:hAnsi="David" w:cs="David" w:eastAsia="David"/>
+          <w:b w:val="0"/>
+          <w:i w:val="0"/>
+          <w:sz w:val="24"/>
+          <w:szCs w:val="24"/>
+        </w:rPr>
+        <w:t>הדר, נ' וגל, ט' (2023ב). לסלוח או לא לסלוח: סליחה דיאלוגית על פגיעות מיניות בתהליכי צדק מאחה. קרימינולוגיה ישראלית, יא, 87-116. https://cris.haifa.ac.il/en/publications/לסלוח-או-לא-לסלוח-סליחה-דיאלוגית-על-פגיעות-מיניות-בתהליכי-צדק-מאח</w:t>
+      </w:r>
+    </w:p>
+    <w:p>
+      <w:pPr>
+        <w:spacing w:lineRule="auto" w:line="360" w:after="160" w:before="0"/>
+        <w:ind w:left="709" w:hanging="709"/>
+        <w:jc w:val="right"/>
+        <w:bidi w:val="1"/>
+      </w:pPr>
+      <w:r>
+        <w:rPr>
+          <w:rFonts w:ascii="David" w:hAnsi="David" w:cs="David" w:eastAsia="David"/>
+          <w:b w:val="0"/>
+          <w:i w:val="0"/>
+          <w:sz w:val="24"/>
+          <w:szCs w:val="24"/>
+        </w:rPr>
+        <w:t>לוינשטיין-ברקאי, ה' (2020). המגדר כן קובע? תמיכה חברתית בקורבנות-גברים של פגיעה מינית לעומת תמיכה בקורבנות-נשים ברשתות חברתיות בישראל. מגמות, נה(2), 167-190. https://info2011.szold.org.il/PDF-Articles/megamot/113341.pdf</w:t>
       </w:r>
     </w:p>
     <w:p>

</xml_diff>

<commit_message>
Verify citations against full-text articles and update findings
Uses the uploaded PDFs to correct page ranges, Lemert's year, the
description of Braithwaite via Bernburg, and to add verified data
from Hadar and Gal (2023a), Keller-Halamish and Peleg-Koriat (2020)
and Levinstein-Barkai (2020).

Co-Authored-By: Claude Fable 5.1 <noreply@anthropic.com>
Claude-Session: https://claude.ai/code/session_01As7S69NaLZWPi9WH4jd1cV
</commit_message>
<xml_diff>
--- a/papers/restorative-justice-summary-paper.docx
+++ b/papers/restorative-justice-summary-paper.docx
@@ -419,7 +419,7 @@
           <w:sz w:val="24"/>
           <w:szCs w:val="24"/>
         </w:rPr>
-        <w:t>צדק מאחה הוא גישה לתגובה חברתית לפשיעה הרואה בעבירה בראש ובראשונה פגיעה בבני אדם וביחסים שביניהם, ולא רק הפרה של חוק המדינה. במקום לשאול איזה חוק הופר ומהו העונש הראוי, הגישה שואלת מי נפגע, מהם צרכיו ומי אחראי לתיקון. ליבת ההליך היא מפגש מונחה בין הנפגע לפוגע, לעיתים בנוכחות תומכים ונציגי קהילה, שבו הפוגע מקבל אחריות על מעשיו והצדדים מגבשים יחד הסכם לתיקון הנזק (קלר-חלמיש ופלג-קוריאט, 2020).</w:t>
+        <w:t>צדק מאחה הוא גישה לתגובה חברתית לפשיעה הרואה בעבירה בראש ובראשונה פגיעה בבני אדם וביחסים שביניהם, ולא רק הפרה של חוק המדינה. השאלה אינה איזה חוק הופר אלא מי נפגע ומי אחראי לתיקון. ליבת ההליך היא מפגש מונחה בין הנפגע לפוגע, לעיתים בנוכחות תומכים ונציגי קהילה, שבו הפוגע מקבל אחריות על מעשיו והצדדים מגבשים יחד הסכם לתיקון הנזק (קלר-חלמיש ופלג-קוריאט, 2020).</w:t>
       </w:r>
     </w:p>
     <w:p>
@@ -436,7 +436,7 @@
           <w:sz w:val="24"/>
           <w:szCs w:val="24"/>
         </w:rPr>
-        <w:t>בישראל פועלות בשירות המבחן לנוער שתי תוכניות ממשלתיות: קד"ם (קבוצות דיון משפחתיות) והנ"ף (היוועדות נפגע-פוגע). לצידן פועלת תוכנית מקבילה בשירות המבחן למבוגרים. ההליך אינו תחליף להליך הפלילי אלא משולב בו, ותוצאותיו נשקלות בהחלטה על סגירת התיק או בגזר הדין (קלר-חלמיש ופלג-קוריאט, 2020). בשנים האחרונות מתרחב השימוש בגישה גם לפגיעות מיניות, תחום שנחשב במשך שנים בלתי מתאים לה. מחקר ישראלי שראיין שש-עשרה שורדות אלימות מינית שהשתתפו במפגשי צדק מאחה מצא כי אצל רבות מהן התפתחה "סליחה דיאלוגית": ירידה ברגשות השליליים כלפי הפוגע שצמחה מתוך השיח במפגש, ולא כדרישה שהוצבה מבחוץ (הדר וגל, 2023ב). במאמר נוסף מאותו מחקר תיארו הנפגעות את התקופה שלאחר ההליך כחוויה של איחוי רגשי, וכותרתו לקוחה מדברי אחת המשתתפות על תחושה שתופרים לה את הלב (הדר וגל, 2023א).</w:t>
+        <w:t>בישראל פועלות בשירות המבחן לנוער שתי תוכניות ממשלתיות: קד"ם (קבוצות דיון משפחתיות) והנ"ף (היוועדות נפגע-פוגע). לצידן פועלת תוכנית מקבילה בשירות המבחן למבוגרים. ההליך אינו תחליף להליך הפלילי אלא משולב בו, ותוצאותיו נשקלות בהחלטה על סגירת התיק או בגזר הדין (קלר-חלמיש ופלג-קוריאט, 2020). בפגיעות מיניות אין עדיין תוכנית ממלכתית. תוכנית "בצדק", הפועלת מאז 2011 ללא תמיכה ממסדית, קיבלה יותר מ-400 פניות, כ-65% מהן מנפגעות ומנפגעים, וכ-30% מהפניות הבשילו לתהליך מלא (הדר וגל, 2023א: 361). מחקר שראיין עשרים נפגעות ונפגעי אלימות מינית שהשתתפו במפגשים כאלה, לצד חמישה תומכים וחמש מנחות, מצא שינויים מיטיבים בעיקר ביחס הנפגעות לעצמן ולפוגע: ירידה בחרדה ובאשמה, תחושת העצמה ומסוגלות והשלמה עם הפגיעה. השינויים ביחס לקהילה היו מצומצמים, ואצל חלק מהנפגעות עלו כעס ואכזבה כלפי משפחה וחברים שלא תמכו (הדר וגל, 2023א). במאמר נוסף מאותו מחקר מתוארת "סליחה דיאלוגית": ירידה ברגשות השליליים כלפי הפוגע שצמחה מתוך השיח במפגש, ולא כדרישה שהוצבה מבחוץ (הדר וגל, 2023ב).</w:t>
       </w:r>
     </w:p>
     <w:p>
@@ -453,7 +453,7 @@
           <w:sz w:val="24"/>
           <w:szCs w:val="24"/>
         </w:rPr>
-        <w:t>הראיות הבינלאומיות זהירות יותר. מטא-אנליזה מעודכנת של 79 הערכות של תוכניות צדק מאחה לנוער מצאה ירידה קטנה עד בינונית בעבריינות חוזרת, לצד עלייה ניכרת בתחושת ההגינות ובשביעות הרצון של הנפגעים ושל הנערים (Kimbrell et al., 2023). מטא-אנליזה נוספת, שכללה גם תוכניות למבוגרים, מצאה ירידה מובהקת אך קטנה בעבריינות חוזרת כללית, וללא השפעה על עבריינות אלימה חוזרת (Fulham et al., 2025).</w:t>
+        <w:t>הראיות הבינלאומיות זהירות יותר. מטא-אנליזה של 79 הערכות של תוכניות לנוער מצאה ירידה קטנה עד בינונית בעבריינות חוזרת, לצד עלייה ניכרת בתחושת ההגינות ובשביעות הרצון של הנפגעים ושל הנערים (Kimbrell et al., 2023). מטא-אנליזה שכללה גם מבוגרים מצאה ירידה קטנה בעבריינות חוזרת כללית, ללא השפעה על עבריינות אלימה חוזרת (Fulham et al., 2025).</w:t>
       </w:r>
     </w:p>
     <w:p>
@@ -516,7 +516,7 @@
           <w:sz w:val="24"/>
           <w:szCs w:val="24"/>
         </w:rPr>
-        <w:t xml:space="preserve"> נקודת המוצא של תיאוריית התיוג היא יחסיות הסטייה: אין מעשה סוטה כשלעצמו, אלא מעשה שהחברה הגיבה עליו והגדירה אותו ככזה. התגובה החברתית לפשיעה, ובעיקר התגובה הפורמלית של משטרה ובית משפט, מדביקה לאדם תווית של "עבריין", והתווית מעצבת את זהותו העצמית ואת יחסם של אחרים אליו. כאן עוברת ההבחנה בין עבריינות ראשונית, מעשה ראשון שאפשר להסבירו בגורמים מזדמנים, לבין עבריינות משנית, שבה הסטייה נעשית לאורח חיים בעקבות התיוג (Lemert, 1951, כפי שמצוטט אצל Bernburg, 2019). סקירת המחקר העדכני מראה שתיוג פלילי רשמי מגדיל את הסיכוי לעבריינות בהמשך בשני מסלולים: הדרה מהזדמנויות קונבנציונליות בחינוך ובתעסוקה, והשתקעות בקבוצות עברייניות שבהן התווית אינה מכשול אלא יתרון (Bernburg, 2019).</w:t>
+        <w:t xml:space="preserve"> נקודת המוצא של תיאוריית התיוג היא יחסיות הסטייה: אין מעשה סוטה כשלעצמו, אלא מעשה שהחברה הגיבה עליו והגדירה אותו ככזה. התגובה החברתית לפשיעה, ובעיקר זו הפורמלית של משטרה ובית משפט, מדביקה לאדם תווית של "עבריין" המעצבת את זהותו ואת יחסם של אחרים אליו. כאן עוברת ההבחנה בין עבריינות ראשונית, מעשה ראשון שאפשר להסבירו בגורמים מזדמנים, לבין עבריינות משנית, שבה הסטייה נעשית לאורח חיים בעקבות התיוג (Lemert, 1967, כפי שמצוטט אצל Bernburg, 2019). סקירת המחקר העדכני מזהה שלושה תהליכים שדרכם תיוג פלילי רשמי מגדיל את הסיכוי לעבריינות בהמשך: גיבוש תפיסה עצמית סוטה, הדרה חברתית שבה מורים, מעסיקים ובני קהילה דוחים את המתויג והוא עצמו נסוג מהם מחשש לדחייה, והשתקעות בקבוצות עברייניות שבהן התווית אינה מכשול אלא יתרון (Bernburg, 2019).</w:t>
       </w:r>
     </w:p>
     <w:p>
@@ -533,7 +533,7 @@
           <w:sz w:val="24"/>
           <w:szCs w:val="24"/>
         </w:rPr>
-        <w:t>צדק מאחה נולד מתוך ביקורת זו. בריית'ווייט הבחין בין בִּיוּש מתייג, המגנה את האדם ומרחיק אותו, לבין ביוש משלב, המגנה את המעשה בלבד ומסתיים במחוות של קבלה מחדש וסליחה (Braithwaite, 1989, כפי שמצוטט אצל Bernburg, 2019). המפגש המאחה הוא הגלמה מוסדית של הביוש המשלב: הפוגע עומד מול הנזק בנוכחות אנשים שחשובים לו, מקבל אחריות, ומתקבל בחזרה לקהילה בתום ההליך. בקד"ם המשפחה המורחבת היא הקהילה המביישת והמשלבת גם יחד, ותוצאה מוצלחת מאפשרת סגירת תיק ללא רישום פלילי, כלומר עצירה של המעבר מעבריינות ראשונית למשנית. הממצאים המתונים של המטא-אנליזה מתיישבים עם ההסבר: ההשפעה על עבריינות חוזרת קיימת, אך היא תלויה באיכות המפגש ובמידה שבה הקהילה אכן מקבלת את הנער בחזרה (Kimbrell et al., 2023).</w:t>
+        <w:t>צדק מאחה נולד מתוך ביקורת זו. בריית'ווייט טען שבחברות קהילתניות הגינוי המוסרי, הבִּיוּש, מלווה במאמצים להשיב את הפוגע לקהילה דרך סליחה, שמירה על הקשרים וטקסים המסמנים שהוא אינו עוד סוטה, ואילו בחברות אינדיבידואליסטיות הביוש מסתיים בסטיגמה, ולכן התיוג הפורמלי בהן קרימינוגני יותר (Braithwaite, 1989, כפי שמצוטט אצל Bernburg, 2019). המפגש המאחה הוא הגלמה מוסדית של הביוש המשלב: הפוגע עומד מול הנזק בנוכחות אנשים שחשובים לו, מקבל אחריות, ומתקבל בחזרה לקהילה בתום ההליך. בקד"ם המשפחה המורחבת היא הקהילה המביישת והמשלבת גם יחד, ותוצאה מוצלחת מאפשרת סגירת תיק ללא רישום פלילי, כלומר עצירה של המעבר מעבריינות ראשונית למשנית. הממצאים המתונים של המטא-אנליזה מתיישבים עם ההסבר: ההשפעה על עבריינות חוזרת קיימת, אך היא תלויה באיכות המפגש ובמידה שבה הקהילה אכן מקבלת את הנער בחזרה (Kimbrell et al., 2023).</w:t>
       </w:r>
     </w:p>
     <w:p>
@@ -550,7 +550,7 @@
           <w:sz w:val="24"/>
           <w:szCs w:val="24"/>
         </w:rPr>
-        <w:t>תיאוריית התיוג חלה גם על הנפגע. ואן דייק טוען שבתרבות המערבית התווית "קורבן" נושאת קונוטציה של סבל פסיבי וחוסר אונים, ומחקרים פסיכולוגיים-חברתיים עדכניים מאששים כי מי שמתויג כקורבן נתפס כחלש ותלותי (Van Dijk, 2020). ההליך הפלילי מקבע את התווית, שכן הנפגע הוא בו עד ולא צד. צדק מאחה מציע מסלול הפוך: הנפגע בוחר אם להשתתף, מדבר בקולו ומעצב את הסכם התיקון, ובכך נע מתווית של קורבן לעמדה של שורד פעיל.</w:t>
+        <w:t>תיאוריית התיוג חלה גם על הנפגע. ואן דייק טוען שבתרבות המערבית התווית "קורבן" נושאת קונוטציה של סבל פסיבי וחוסר אונים, ומחקרים פסיכולוגיים-חברתיים עדכניים מאששים כי מי שמתויג כקורבן נתפס כחלש ותלותי (Van Dijk, 2020). ההליך הפלילי מקבע את התווית, שכן הנפגע הוא בו עד ולא צד. צדק מאחה מציע מסלול הפוך: הנפגע בוחר, מדבר בקולו ומעצב את הסכם התיקון, ונע מתווית של קורבן לעמדה של שורד פעיל.</w:t>
       </w:r>
     </w:p>
     <w:p>
@@ -595,7 +595,7 @@
           <w:sz w:val="24"/>
           <w:szCs w:val="24"/>
         </w:rPr>
-        <w:t>מחאת #MeToo שינתה את המאזן. קלר-חלמיש ופלג-קוריאט (2020) טוענות כי המחאה חשפה את היקף הפגיעות ואת כישלונו של ההליך הפלילי לתת מענה לרובן, ולכן יש להנגיש צדק מאחה לפגיעות מיניות בתנאים מגוננים: השתתפות וולונטרית, הכנה ממושכת, מנחים מיומנים וזכותה של הנפגעת לעצור בכל שלב. ממצאי הראיונות עם השורדות תומכים בעמדה זו. הסליחה, כשהופיעה, לא הייתה תנאי ולא דרישה אלא תוצר של הדיאלוג, ומשתתפות שלא סלחו דיווחו אף הן על הכרה ועל השבת השליטה (הדר וגל, 2023ב). התגובה החברתית לנפגע עצמו ממוגדרת אף היא. ניתוח של 1,890 תגובות גולשים לחשיפות של נפגעי פגיעה מינית במסגרת #MeToo בישראל מצא שנשים זכו לתמיכה רגשית ורשתית רבה יותר מגברים, ואילו גברים קיבלו בעיקר תמיכה הערכתית (לוינשטיין-ברקאי, 2020). מי שאינו תואם את דמות הקורבן המצופה זוכה לפחות הכרה. הביקורת הפמיניסטית על "הקורבן האידיאלי", זו שזוכה להכרה רק אם היא תמימה וחסרת אשמה, מהדהדת גם בממצאים על הבדלים אתניים בתמיכה בצדק מאחה: מי נחשב ראוי להליך מאחה ומי לענישה בלבד תלוי בזהות המעורבים, ולא רק במעשה (Peleg-Koriat, 2025).</w:t>
+        <w:t>מחאת #MeToo שינתה את המאזן. קלר-חלמיש ופלג-קוריאט (2020) טוענות כי המחאה חשפה את היקף הפגיעות ואת כישלונו של ההליך הפלילי לתת מענה לרובן, ולכן יש להנגיש צדק מאחה לפגיעות מיניות בתנאים מגוננים: וולונטריות מלאה לכל הצדדים, הכנה מעמיקה של המשתתפים, מנחים בעלי מומחיות בתחום, וקריטריונים ברורים לבחינת התאמת המקרה. ממצאי הראיונות עם הנפגעות תומכים בעמדה זו. הן תיארו את ההליך כחוויה של החזרת שליטה ואוטונומיה, שכן הן מובילות אותו ומחליטות על כל פרט בו, ואת הסליחה, כשהופיעה, כתוצר של הדיאלוג ולא כתנאי (הדר וגל, 2023א, 2023ב). התגובה החברתית לנפגע עצמו ממוגדרת אף היא. ניתוח של 1,890 תגובות גולשים לחשיפות של נפגעי פגיעה מינית במסגרת #MeToo בישראל מצא שרק 1.1% מהתגובות היו לא תומכות, אך נשים זכו לתמיכה רגשית ורשתית רבה יותר מגברים, ואילו גברים קיבלו יותר תמיכה מעריכה, דפוס המבטא סטריאוטיפים מגדריים כלפי קורבנותם (לוינשטיין-ברקאי, 2020). הביקורת הפמיניסטית על "הקורבן האידיאלי", זו שזוכה להכרה רק אם היא תמימה וחסרת אשמה, מהדהדת גם בממצאים על הבדלים אתניים בתמיכה בצדק מאחה: מי נחשב ראוי להליך מאחה ומי לענישה בלבד תלוי בזהות המעורבים, ולא רק במעשה (Peleg-Koriat, 2025).</w:t>
       </w:r>
     </w:p>
     <w:p>
@@ -612,7 +612,7 @@
           <w:sz w:val="24"/>
           <w:szCs w:val="24"/>
         </w:rPr>
-        <w:t>ממצא זה מתחדד במחקר ניסויי נוסף שנערך בישראל. בשני ניסויים, האחד עם 446 משתתפים והשני עם 560, נמצאה הטיה אתנית מובהקת בתמיכה בצדק מאחה בהתאם לזהותם של הפוגע, הנפגע והמשיב, והטיה זו הייתה חזקה יותר בהקשרים פוליטיים טעונים מאשר בעבירות פליליות רגילות (Peleg-Koriat et al., 2025). התיווך נעשה דרך אמונות בדבר יכולתו של האדם להשתנות: מי שמאמין שהפוגע יכול להשתנות תומך בהליך, והאמונה הזו עצמה תלויה בזהות. מנקודת מבטה של תיאוריית התיוג זו הדגמה ישירה של יחסיות הסטייה. אותו מעשה נתפס כניתן לתיקון או כבלתי ניתן לתיקון לפי מי שביצע אותו, וההחלטה מי יופנה להליך מאחה ומי לענישה היא עצמה תגובה חברתית שמייצרת עבריינים.</w:t>
+        <w:t>ממצא זה מתחדד בשני ניסויים שנערכו בישראל, עם 446 ו-560 משתתפים: נמצאה הטיה אתנית מובהקת בתמיכה בצדק מאחה לפי זהותם של הפוגע, הנפגע והמשיב, חזקה יותר בהקשרים פוליטיים טעונים מאשר בעבירות רגילות, ומתווכת דרך האמונה ביכולתו של הפוגע להשתנות (Peleg-Koriat et al., 2025). מנקודת מבטה של תיאוריית התיוג זו הדגמה ישירה של יחסיות הסטייה: אותו מעשה נתפס כניתן לתיקון או לא לפי מי שביצע אותו, וההחלטה מי יופנה להליך מאחה ומי לענישה היא עצמה תגובה חברתית שמייצרת עבריינים.</w:t>
       </w:r>
     </w:p>
     <w:p>
@@ -629,7 +629,7 @@
           <w:sz w:val="24"/>
           <w:szCs w:val="24"/>
         </w:rPr>
-        <w:t>שתי התיאוריות משלימות זו את זו ומתנגשות בנקודה אחת. התיוג ממקד את המבט בפוגע ובשאלה כיצד למנוע את קיבוע זהותו העבריינית. הוויקטימולוגיה הפמיניסטית ממקדת אותו בנפגעת ובפערי הכוח. הצלחת ההליך תלויה ביכולת להחזיק את שתיהן בו-זמנית: שילוב מחדש של הפוגע, בלי שהמחיר יהיה קולה של הנפגעת.</w:t>
+        <w:t>שתי התיאוריות משלימות זו את זו ומתנגשות בנקודה אחת. התיוג ממקד את המבט בפוגע ובמניעת קיבוע זהותו העבריינית, והוויקטימולוגיה הפמיניסטית בנפגעת ובפערי הכוח. הצלחת ההליך תלויה ביכולת להחזיק את שתיהן: שילוב מחדש של הפוגע, בלי שהמחיר יהיה קולה של הנפגעת.</w:t>
       </w:r>
     </w:p>
     <w:p>
@@ -939,7 +939,7 @@
           <w:sz w:val="24"/>
           <w:szCs w:val="24"/>
         </w:rPr>
-        <w:t>קלר-חלמיש, כ' ופלג-קוריאט, ע' (2020). ממחאה לאיחוי: מחאת #MeToo כרקע לפיתוח והנגשה של תהליכי צדק מאחה במקרים של פגיעה מינית. קרימינולוגיה ישראלית, ט, 33-54. https://papers.ssrn.com/sol3/papers.cfm?abstract_id=3901353</w:t>
+        <w:t>קלר-חלמיש, כ' ופלג-קוריאט, ע' (2020). ממחאה לאיחוי: מחאת #MeToo כרקע לפיתוח והנגשה של תהליכי צדק מאחה במקרים של פגיעה מינית. קרימינולוגיה ישראלית, ט, 33-53. https://papers.ssrn.com/sol3/papers.cfm?abstract_id=3901353</w:t>
       </w:r>
     </w:p>
     <w:p>

</xml_diff>

<commit_message>
Restrict sources to the seven full-text articles provided
Rewrites sections A, B and D to rely only on the uploaded articles,
with page-specific citations verified against the PDFs.

Co-Authored-By: Claude Fable 5.1 <noreply@anthropic.com>
Claude-Session: https://claude.ai/code/session_01As7S69NaLZWPi9WH4jd1cV
</commit_message>
<xml_diff>
--- a/papers/restorative-justice-summary-paper.docx
+++ b/papers/restorative-justice-summary-paper.docx
@@ -436,7 +436,7 @@
           <w:sz w:val="24"/>
           <w:szCs w:val="24"/>
         </w:rPr>
-        <w:t>בישראל פועלות בשירות המבחן לנוער שתי תוכניות ממשלתיות: קד"ם (קבוצות דיון משפחתיות) והנ"ף (היוועדות נפגע-פוגע). לצידן פועלת תוכנית מקבילה בשירות המבחן למבוגרים. ההליך אינו תחליף להליך הפלילי אלא משולב בו, ותוצאותיו נשקלות בהחלטה על סגירת התיק או בגזר הדין (קלר-חלמיש ופלג-קוריאט, 2020). בפגיעות מיניות אין עדיין תוכנית ממלכתית. תוכנית "בצדק", הפועלת מאז 2011 ללא תמיכה ממסדית, קיבלה יותר מ-400 פניות, כ-65% מהן מנפגעות ומנפגעים, וכ-30% מהפניות הבשילו לתהליך מלא (הדר וגל, 2023א: 361). מחקר שראיין עשרים נפגעות ונפגעי אלימות מינית שהשתתפו במפגשים כאלה, לצד חמישה תומכים וחמש מנחות, מצא שינויים מיטיבים בעיקר ביחס הנפגעות לעצמן ולפוגע: ירידה בחרדה ובאשמה, תחושת העצמה ומסוגלות והשלמה עם הפגיעה. השינויים ביחס לקהילה היו מצומצמים, ואצל חלק מהנפגעות עלו כעס ואכזבה כלפי משפחה וחברים שלא תמכו (הדר וגל, 2023א). במאמר נוסף מאותו מחקר מתוארת "סליחה דיאלוגית": ירידה ברגשות השליליים כלפי הפוגע שצמחה מתוך השיח במפגש, ולא כדרישה שהוצבה מבחוץ (הדר וגל, 2023ב).</w:t>
+        <w:t>הנתונים על פגיעות מיניות ממחישים מדוע הגישה מושכת תשומת לב. רק 13.7% מהפונות למרכזי הסיוע לנפגעות תקיפה מינית מגישות תלונה במשטרה, וכ-84% מהתלונות נסגרות ללא כתב אישום, כך שהצדק הפורמלי חומק מידיהן של רוב הנפגעות (קלר-חלמיש ופלג-קוריאט, 2020: 37-38). בישראל אין תוכנית ממלכתית לצדק מאחה בעבירות מין, אף שוועדה בין-משרדית בראשות השופטת בדימוס ברלינר המליצה ב-2020 לפתח אותה. תוכנית "בצדק", הפועלת מאז 2011 ללא תמיכה ממסדית, קיבלה יותר מ-400 פניות, כ-65% מהן מנפגעות ומנפגעים, וכ-30% מהפניות הבשילו לתהליך מלא (הדר וגל, 2023: 356, 361). מחקר שראיין עשרים נפגעות ונפגעי אלימות מינית שהשתתפו במפגשים כאלה, לצד חמישה תומכים וחמש מנחות, מצא שינויים מיטיבים בעיקר ביחס הנפגעות לעצמן ולפוגע: ירידה בחרדה ובאשמה, תחושת העצמה ומסוגלות והשלמה עם הפגיעה. השינויים ביחס לקהילה היו מצומצמים, ואצל חלק מהנפגעות עלו כעס ואכזבה כלפי משפחה וחברים שלא תמכו (הדר וגל, 2023: 364-368).</w:t>
       </w:r>
     </w:p>
     <w:p>
@@ -453,24 +453,7 @@
           <w:sz w:val="24"/>
           <w:szCs w:val="24"/>
         </w:rPr>
-        <w:t>הראיות הבינלאומיות זהירות יותר. מטא-אנליזה של 79 הערכות של תוכניות לנוער מצאה ירידה קטנה עד בינונית בעבריינות חוזרת, לצד עלייה ניכרת בתחושת ההגינות ובשביעות הרצון של הנפגעים ושל הנערים (Kimbrell et al., 2023). מטא-אנליזה שכללה גם מבוגרים מצאה ירידה קטנה בעבריינות חוזרת כללית, ללא השפעה על עבריינות אלימה חוזרת (Fulham et al., 2025).</w:t>
-      </w:r>
-    </w:p>
-    <w:p>
-      <w:pPr>
-        <w:spacing w:lineRule="auto" w:line="360" w:after="120" w:before="0"/>
-        <w:jc w:val="both"/>
-        <w:bidi w:val="1"/>
-      </w:pPr>
-      <w:r>
-        <w:rPr>
-          <w:rFonts w:ascii="David" w:hAnsi="David" w:cs="David" w:eastAsia="David"/>
-          <w:b w:val="0"/>
-          <w:i w:val="0"/>
-          <w:sz w:val="24"/>
-          <w:szCs w:val="24"/>
-        </w:rPr>
-        <w:t>ההיבט הרב-תרבותי בולט בישראל במיוחד, והוא ניכר בעמדות הציבור. במחקר ישראלי עדכני תפסו משתתפים יהודים פגיעה מינית בתוך המשפחה כחמורה יותר מפגיעה מחוץ לה ותמכו פחות בצדק מאחה במקרים אלה, ואילו משתתפים ערבים לא הבחינו בין שני סוגי הפגיעה, ותמיכתם בהליך הושפעה פחות מחומרת העבירה (Peleg-Koriat, 2025).</w:t>
+        <w:t>בהשוואה בינלאומית, תהליכי צדק מאחה בפגיעות מיניות מתקיימים ברחבי העולם בתוכניות שונות, חלקן ממוקדות בנפגעת, חלקן בפוגע או בבני נוער, ובמגוון רחב של קשרי גומלין עם רשויות המדינה, כך שאין מודל אחד שעונה על ציפיות כל הצדדים (קלר-חלמיש ופלג-קוריאט, 2020: 46-47). ההיבט הרב-תרבותי בולט בישראל במיוחד. בחברה הערבית, הקולקטיביסטית יותר, כבוד המשפחה ושמה מובילים משפחות רבות להעדיף טיפול פנימי בפגיעה, בין השאר דרך הסולחה המסורתית, שדומה בתכליתה לצדק מאחה, וזאת גם על רקע אמון נמוך במשטרה ובמערכת המשפט (Peleg-Koriat, 2026: 1907). במחקר שהשווה בין 257 משיבים יהודים ל-260 ערבים, היהודים תפסו פגיעה מינית בתוך המשפחה כחמורה יותר מפגיעה מחוץ לה ותמכו פחות בצדק מאחה במקרים אלה, ואילו הערבים לא הבחינו בין שני סוגי הפגיעה, ותמיכתם בהליך הייתה גבוהה יותר והושפעה פחות מחומרת העבירה (Peleg-Koriat, 2026).</w:t>
       </w:r>
     </w:p>
     <w:p>
@@ -516,7 +499,7 @@
           <w:sz w:val="24"/>
           <w:szCs w:val="24"/>
         </w:rPr>
-        <w:t xml:space="preserve"> נקודת המוצא של תיאוריית התיוג היא יחסיות הסטייה: אין מעשה סוטה כשלעצמו, אלא מעשה שהחברה הגיבה עליו והגדירה אותו ככזה. התגובה החברתית לפשיעה, ובעיקר זו הפורמלית של משטרה ובית משפט, מדביקה לאדם תווית של "עבריין" המעצבת את זהותו ואת יחסם של אחרים אליו. כאן עוברת ההבחנה בין עבריינות ראשונית, מעשה ראשון שאפשר להסבירו בגורמים מזדמנים, לבין עבריינות משנית, שבה הסטייה נעשית לאורח חיים בעקבות התיוג (Lemert, 1967, כפי שמצוטט אצל Bernburg, 2019). סקירת המחקר העדכני מזהה שלושה תהליכים שדרכם תיוג פלילי רשמי מגדיל את הסיכוי לעבריינות בהמשך: גיבוש תפיסה עצמית סוטה, הדרה חברתית שבה מורים, מעסיקים ובני קהילה דוחים את המתויג והוא עצמו נסוג מהם מחשש לדחייה, והשתקעות בקבוצות עברייניות שבהן התווית אינה מכשול אלא יתרון (Bernburg, 2019).</w:t>
+        <w:t xml:space="preserve"> נקודת המוצא של תיאוריית התיוג היא יחסיות הסטייה: אין מעשה סוטה כשלעצמו, אלא מעשה שהחברה הגיבה עליו והגדירה אותו ככזה. התגובה החברתית לפשיעה, ובעיקר זו הפורמלית של משטרה ובית משפט, מדביקה לאדם תווית של "עבריין" המעצבת את זהותו ואת יחסם של אחרים אליו. כאן עוברת ההבחנה בין עבריינות ראשונית, מעשה ראשון בעל גורמים מזדמנים, לבין עבריינות משנית, שבה הסטייה נעשית לאמצעי הגנה או הסתגלות לבעיות שהתיוג עצמו יצר (Lemert, 1967, כפי שמצוטט אצל Bernburg, 2019). סקירת המחקר העדכני מזהה שלושה תהליכים שדרכם תיוג פלילי רשמי מגדיל את הסיכוי לעבריינות בהמשך: גיבוש תפיסה עצמית סוטה, הדרה חברתית שבה מורים, מעסיקים ובני קהילה דוחים את המתויג והוא עצמו נסוג מהם מחשש לדחייה, והשתקעות בקבוצות עברייניות שבהן התווית אינה מכשול אלא יתרון. מיעוטים ועניים פגיעים יותר לתיוג בשל סטריאוטיפים הקושרים אותם לפשיעה (Bernburg, 2019).</w:t>
       </w:r>
     </w:p>
     <w:p>
@@ -533,7 +516,7 @@
           <w:sz w:val="24"/>
           <w:szCs w:val="24"/>
         </w:rPr>
-        <w:t>צדק מאחה נולד מתוך ביקורת זו. בריית'ווייט טען שבחברות קהילתניות הגינוי המוסרי, הבִּיוּש, מלווה במאמצים להשיב את הפוגע לקהילה דרך סליחה, שמירה על הקשרים וטקסים המסמנים שהוא אינו עוד סוטה, ואילו בחברות אינדיבידואליסטיות הביוש מסתיים בסטיגמה, ולכן התיוג הפורמלי בהן קרימינוגני יותר (Braithwaite, 1989, כפי שמצוטט אצל Bernburg, 2019). המפגש המאחה הוא הגלמה מוסדית של הביוש המשלב: הפוגע עומד מול הנזק בנוכחות אנשים שחשובים לו, מקבל אחריות, ומתקבל בחזרה לקהילה בתום ההליך. בקד"ם המשפחה המורחבת היא הקהילה המביישת והמשלבת גם יחד, ותוצאה מוצלחת מאפשרת סגירת תיק ללא רישום פלילי, כלומר עצירה של המעבר מעבריינות ראשונית למשנית. הממצאים המתונים של המטא-אנליזה מתיישבים עם ההסבר: ההשפעה על עבריינות חוזרת קיימת, אך היא תלויה באיכות המפגש ובמידה שבה הקהילה אכן מקבלת את הנער בחזרה (Kimbrell et al., 2023).</w:t>
+        <w:t>צדק מאחה נולד מתוך ביקורת זו. בריית'ווייט טען שבחברות קהילתניות הגינוי המוסרי, הבִּיוּש, מלווה במאמצים להשיב את הפוגע לקהילה דרך סליחה, שמירה על הקשרים וטקסים המסמנים שהוא אינו עוד סוטה, ואילו בחברות אינדיבידואליסטיות הביוש מסתיים בסטיגמה, ולכן התיוג הפורמלי בהן קרימינוגני יותר (Braithwaite, 1989, כפי שמצוטט אצל Bernburg, 2019). המפגש המאחה הוא הגלמה מוסדית של הרעיון: הפוגע עומד מול הנזק בנוכחות אנשים שחשובים לו, מקבל אחריות, ומתקבל בחזרה לקהילה בתום ההליך. הנפגעות עצמן ציפו שהפוגע ייקח אחריות במפגש, ותומך של נפגע תיאר את כוחה של הקהילה להיות מגוננת ולהתמודד עם הפוגע בעת ובעונה אחת (הדר וגל, 2023: 364-367).</w:t>
       </w:r>
     </w:p>
     <w:p>
@@ -550,7 +533,24 @@
           <w:sz w:val="24"/>
           <w:szCs w:val="24"/>
         </w:rPr>
-        <w:t>תיאוריית התיוג חלה גם על הנפגע. ואן דייק טוען שבתרבות המערבית התווית "קורבן" נושאת קונוטציה של סבל פסיבי וחוסר אונים, ומחקרים פסיכולוגיים-חברתיים עדכניים מאששים כי מי שמתויג כקורבן נתפס כחלש ותלותי (Van Dijk, 2020). ההליך הפלילי מקבע את התווית, שכן הנפגע הוא בו עד ולא צד. צדק מאחה מציע מסלול הפוך: הנפגע בוחר, מדבר בקולו ומעצב את הסכם התיקון, ונע מתווית של קורבן לעמדה של שורד פעיל.</w:t>
+        <w:t>תיאוריית התיוג חלה גם על הנפגע. ואן דייק מראה שהמילה "קורבן" בשפות המערב נגזרת מן המילה הלטינית לבעל חיים המוקרב, בעוד שבסינית וביפנית מכונה הנפגע במונח ניטרלי, "מי שספג את הנזק". התווית נושאת קונוטציה של סבל פסיבי וחוסר אונים, ומי שמסרב לה ומציג את עצמו כשורד חזק מעורר לעיתים עוינות (Van Dijk, 2020: 74-76). ניסוי שבו תוארה אותה אישה פעם כ"קורבן" ופעם כ"שורדת" של אונס מצא שהמילה "קורבן" גרמה למשיבים לתפוס אותה כחלשה, פסיבית ותמימה יותר (Papendick &amp; Bohner, 2017, כפי שמצוטט אצל Van Dijk, 2020). ההליך הפלילי מקבע את התווית, שכן הנפגע הוא בו עד ולא צד. צדק מאחה מציע מסלול הפוך: הנפגע בוחר, מדבר בקולו ומעצב את הסכם התיקון.</w:t>
+      </w:r>
+    </w:p>
+    <w:p>
+      <w:pPr>
+        <w:spacing w:lineRule="auto" w:line="360" w:after="120" w:before="0"/>
+        <w:jc w:val="both"/>
+        <w:bidi w:val="1"/>
+      </w:pPr>
+      <w:r>
+        <w:rPr>
+          <w:rFonts w:ascii="David" w:hAnsi="David" w:cs="David" w:eastAsia="David"/>
+          <w:b w:val="0"/>
+          <w:i w:val="0"/>
+          <w:sz w:val="24"/>
+          <w:szCs w:val="24"/>
+        </w:rPr>
+        <w:t>יחסיות הסטייה ניכרת גם בשאלה מי נחשב ראוי להליך מאחה. בשני ניסויים שנערכו בישראל, עם 446 ו-560 משתתפים, נמצאה הטיה אתנית מובהקת בתמיכה בצדק מאחה לפי זהותם של הפוגע, הנפגע והמשיב, חזקה יותר בעבירות על רקע פוליטי מאשר בעבירות פליליות רגילות, ומתווכת במלואה דרך האמונה ביכולתו של הפוגע להשתנות (Peleg-Koriat et al., 2025). אותו מעשה נתפס כניתן לתיקון או לא לפי מי שביצע אותו, וההחלטה מי יופנה להליך מאחה ומי לענישה היא עצמה תגובה חברתית מתייגת.</w:t>
       </w:r>
     </w:p>
     <w:p>
@@ -578,7 +578,7 @@
           <w:sz w:val="24"/>
           <w:szCs w:val="24"/>
         </w:rPr>
-        <w:t xml:space="preserve"> הגישה השנייה בוחנת את הנושא מכיוון מנוגד. הוויקטימולוגיה הפמיניסטית מדגישה את האופי הממוגדר של הקורבנות, את הקשר בין קורבנות נשים לבין עבריינותן, ואת תפקידה של האלימות כלפי נשים, ואיום האלימות, כאמצעי של פיקוח חברתי בלתי פורמלי (Clay-Warner &amp; Edgemon, 2020). מנקודת מבט זו ההליך הפלילי בפגיעות מיניות מייצר קורבנות משנית: חקירה נגדית, מיתוסים של אונס ואשמת הקורבן. אך גם צדק מאחה חשוד בעיניה, משום שהוא עלול לשחזר במפגש את פערי הכוח שבין הפוגע לנפגעת, להפעיל עליה לחץ לסלוח ולהפריט פגיעה שהיא בעיה ציבורית (קלר-חלמיש ופלג-קוריאט, 2020).</w:t>
+        <w:t xml:space="preserve"> הגישה השנייה בוחנת את הנושא מכיוון מנוגד, מנקודת מבטה של הנפגעת ושל יחסי הכוח הממוגדרים סביבה. המאבק הפמיניסטי של שלושים השנים האחרונות שינה חוקים ונהלים, אך לא את חוויית הנפגעות בהליך הפלילי, שמתמקד בנאשם ולא בהן. הספרות מכנה את המסע שהן עוברות בו "אונס שני": חוסר אמון, זלזול, פקפוק בחוויותיהן, והפיכתן לאובייקט כפי שנעשה להן בעת הפגיעה, כלומר קורבנות משנית (קלר-חלמיש ופלג-קוריאט, 2020: 37-38). מול זה עומדים צורכי הצדק וההחלמה של הנפגעות: תחושת ביטחון והטלת האחריות על הפוגע, קבלת תשובות, איחוי מערכות היחסים, ואיחוי תחושת העצמי והפסקת ההאשמה העצמית (קלר-חלמיש ופלג-קוריאט, 2020: 37).</w:t>
       </w:r>
     </w:p>
     <w:p>
@@ -595,7 +595,7 @@
           <w:sz w:val="24"/>
           <w:szCs w:val="24"/>
         </w:rPr>
-        <w:t>מחאת #MeToo שינתה את המאזן. קלר-חלמיש ופלג-קוריאט (2020) טוענות כי המחאה חשפה את היקף הפגיעות ואת כישלונו של ההליך הפלילי לתת מענה לרובן, ולכן יש להנגיש צדק מאחה לפגיעות מיניות בתנאים מגוננים: וולונטריות מלאה לכל הצדדים, הכנה מעמיקה של המשתתפים, מנחים בעלי מומחיות בתחום, וקריטריונים ברורים לבחינת התאמת המקרה. ממצאי הראיונות עם הנפגעות תומכים בעמדה זו. הן תיארו את ההליך כחוויה של החזרת שליטה ואוטונומיה, שכן הן מובילות אותו ומחליטות על כל פרט בו, ואת הסליחה, כשהופיעה, כתוצר של הדיאלוג ולא כתנאי (הדר וגל, 2023א, 2023ב). התגובה החברתית לנפגע עצמו ממוגדרת אף היא. ניתוח של 1,890 תגובות גולשים לחשיפות של נפגעי פגיעה מינית במסגרת #MeToo בישראל מצא שרק 1.1% מהתגובות היו לא תומכות, אך נשים זכו לתמיכה רגשית ורשתית רבה יותר מגברים, ואילו גברים קיבלו יותר תמיכה מעריכה, דפוס המבטא סטריאוטיפים מגדריים כלפי קורבנותם (לוינשטיין-ברקאי, 2020). הביקורת הפמיניסטית על "הקורבן האידיאלי", זו שזוכה להכרה רק אם היא תמימה וחסרת אשמה, מהדהדת גם בממצאים על הבדלים אתניים בתמיכה בצדק מאחה: מי נחשב ראוי להליך מאחה ומי לענישה בלבד תלוי בזהות המעורבים, ולא רק במעשה (Peleg-Koriat, 2025).</w:t>
+        <w:t>התגובה החברתית לנפגע עצמו ממוגדרת אף היא. ניתוח של 1,890 תגובות גולשים לחשיפות של נפגעי פגיעה מינית במסגרת #MeToo בישראל מצא שרק 1.1% מהתגובות היו לא תומכות, אך נשים זכו לתמיכה רגשית ורשתית רבה יותר מגברים, ואילו גברים קיבלו יותר תמיכה מעריכה, דפוס המבטא סטריאוטיפים מגדריים כלפי קורבנותם (לוינשטיין-ברקאי, 2020). זו הסיבה שהגישה הפמיניסטית מתנגדת לדמות "הקורבן האידיאלי" ודורשת הכרה גם במי שאינו תואם אותה. אך גם צדק מאחה חשוד בעיניה, בשל מאפייניה הייחודיים של הפגיעה המינית: הבושה, הטאבו, הפגיעה הרגשית המוגברת, החשש לביטחון והפגיעה באמון הבסיסי, שכן רוב הפוגעים מוכרים לנפגעת. קלר-חלמיש ופלג-קוריאט (2020) טוענות שמחאת #MeToo חשפה את כישלון ההליך הפלילי, ולכן יש להנגיש צדק מאחה לפגיעות מיניות בתנאים מגוננים: וולונטריות מלאה לכל הצדדים, הכנה מעמיקה, מנחים בעלי מומחיות וקריטריונים ברורים להתאמת המקרה (עמ' 43-45). ממצאי הראיונות תומכים בעמדה זו. הנפגעות תיארו את ההליך כחוויה של החזרת שליטה ואוטונומיה, שכן הן מובילות אותו ומחליטות על כל פרט בו (הדר וגל, 2023: 369-370).</w:t>
       </w:r>
     </w:p>
     <w:p>
@@ -612,24 +612,7 @@
           <w:sz w:val="24"/>
           <w:szCs w:val="24"/>
         </w:rPr>
-        <w:t>ממצא זה מתחדד בשני ניסויים שנערכו בישראל, עם 446 ו-560 משתתפים: נמצאה הטיה אתנית מובהקת בתמיכה בצדק מאחה לפי זהותם של הפוגע, הנפגע והמשיב, חזקה יותר בהקשרים פוליטיים טעונים מאשר בעבירות רגילות, ומתווכת דרך האמונה ביכולתו של הפוגע להשתנות (Peleg-Koriat et al., 2025). מנקודת מבטה של תיאוריית התיוג זו הדגמה ישירה של יחסיות הסטייה: אותו מעשה נתפס כניתן לתיקון או לא לפי מי שביצע אותו, וההחלטה מי יופנה להליך מאחה ומי לענישה היא עצמה תגובה חברתית שמייצרת עבריינים.</w:t>
-      </w:r>
-    </w:p>
-    <w:p>
-      <w:pPr>
-        <w:spacing w:lineRule="auto" w:line="360" w:after="120" w:before="0"/>
-        <w:jc w:val="both"/>
-        <w:bidi w:val="1"/>
-      </w:pPr>
-      <w:r>
-        <w:rPr>
-          <w:rFonts w:ascii="David" w:hAnsi="David" w:cs="David" w:eastAsia="David"/>
-          <w:b w:val="0"/>
-          <w:i w:val="0"/>
-          <w:sz w:val="24"/>
-          <w:szCs w:val="24"/>
-        </w:rPr>
-        <w:t>שתי התיאוריות משלימות זו את זו ומתנגשות בנקודה אחת. התיוג ממקד את המבט בפוגע ובמניעת קיבוע זהותו העבריינית, והוויקטימולוגיה הפמיניסטית בנפגעת ובפערי הכוח. הצלחת ההליך תלויה ביכולת להחזיק את שתיהן: שילוב מחדש של הפוגע, בלי שהמחיר יהיה קולה של הנפגעת.</w:t>
+        <w:t>שתי התיאוריות משלימות זו את זו ומתנגשות בנקודה אחת. התיוג ממקד את המבט בפוגע ובמניעת קיבוע זהותו העבריינית, והוויקטימולוגיה הפמיניסטית בנפגעת ובפערי הכוח. ההליך מצליח רק כשהוא מחזיק את שתיהן: שילוב הפוגע מחדש בלי שהמחיר יהיה קולה של הנפגעת.</w:t>
       </w:r>
     </w:p>
     <w:p>
@@ -848,7 +831,7 @@
           <w:sz w:val="24"/>
           <w:szCs w:val="24"/>
         </w:rPr>
-        <w:t>ההבדל הראשון הוא במעמד הטיעון. הקרימינולוגיה תיאורית ואמפירית, והיא מודדת אם ההליך מפחית עבריינות חוזרת ומיטיב עם הנפגע (Kimbrell et al., 2023). היהדות נורמטיבית: היא אינה שואלת אם המפגש עובד אלא קובעת שהוא חובה. ההבדל השני, החריף יותר, נוגע לנפגע. הוויקטימולוגיה הפמיניסטית, וכמוה החשיבה הטיפולית העכשווית, עומדות על כך שסליחה אינה יכולה להיות חובה ואינה יכולה לבוא מבחוץ, אלא רק בקצב של הנפגע (הדר וגל, 2023ב; Clay-Warner &amp; Edgemon, 2020). ההלכה, לעומת זאת, מכנה סרבן מחילה "אכזרי". הסתירה מתמתנת כשמבחינים בין הליך לעמדה מוסרית: ההלכה אינה כופה מפגש, מתירה לפוגע להניח לנפגע לאחר שלוש פניות, ומכוונת את תביעתה אל תודעת הנפגע ולא אל בית הדין. תרומת הקרימינולוגיה היא הזהירות, כלומר ידע אמפירי על פערי כוח ועל תנאי ההצלחה של המפגש. תרומת היהדות היא התביעה המוסרית: הפוגע חייב לעמוד מול מי שפגע בו, והנפגע אינו רק מושא להגנה אלא סובייקט מוסרי בעל אחריות.</w:t>
+        <w:t>ההבדל הראשון הוא במעמד הטיעון. הקרימינולוגיה תיאורית ואמפירית, והיא בודקת מה ההליך עושה בפועל לנפגעות ולפוגעים (הדר וגל, 2023). היהדות נורמטיבית: היא אינה שואלת אם המפגש עובד אלא קובעת שהוא חובה. ההבדל השני, החריף יותר, נוגע לנפגע. הוויקטימולוגיה הפמיניסטית עומדת על כך שההליך חייב להיות וולונטרי לחלוטין ושהסליחה, אם תבוא, תצמח מתוך הדיאלוג ובקצב של הנפגעת (הדר וגל, 2023; קלר-חלמיש ופלג-קוריאט, 2020). ההלכה, לעומת זאת, מכנה סרבן מחילה "אכזרי". הסתירה מתמתנת כשמבחינים בין הליך לעמדה מוסרית: ההלכה אינה כופה מפגש, מתירה לפוגע להניח לנפגע לאחר שלוש פניות, ומכוונת את תביעתה אל תודעת הנפגע ולא אל בית הדין. תרומת הקרימינולוגיה היא הזהירות, כלומר ידע אמפירי על פערי כוח ועל תנאי ההצלחה של המפגש. תרומת היהדות היא התביעה המוסרית: הפוגע חייב לעמוד מול מי שפגע בו, והנפגע אינו רק מושא להגנה אלא סובייקט מוסרי בעל אחריות.</w:t>
       </w:r>
     </w:p>
     <w:p>
@@ -885,25 +868,7 @@
           <w:sz w:val="24"/>
           <w:szCs w:val="24"/>
         </w:rPr>
-        <w:t>הדר, נ' וגל, ט' (2023א). "הרגשתי איך תופרים לי את הלב": החוויה הרגשית של נפגעות אלימות מינית בעקבות תהליכי צדק מאחה. חברה ורווחה, מג(3), 355-375. https://www.gov.il/BlobFolder/reports/molsa-43-3-nataly-h/he/SocialAndWelfareMagazine_Magazine-43-3_43-3-NATALY-H.pdf</w:t>
-      </w:r>
-    </w:p>
-    <w:p>
-      <w:pPr>
-        <w:spacing w:lineRule="auto" w:line="360" w:after="160" w:before="0"/>
-        <w:ind w:left="709" w:hanging="709"/>
-        <w:jc w:val="right"/>
-        <w:bidi w:val="1"/>
-      </w:pPr>
-      <w:r>
-        <w:rPr>
-          <w:rFonts w:ascii="David" w:hAnsi="David" w:cs="David" w:eastAsia="David"/>
-          <w:b w:val="0"/>
-          <w:i w:val="0"/>
-          <w:sz w:val="24"/>
-          <w:szCs w:val="24"/>
-        </w:rPr>
-        <w:t>הדר, נ' וגל, ט' (2023ב). לסלוח או לא לסלוח: סליחה דיאלוגית על פגיעות מיניות בתהליכי צדק מאחה. קרימינולוגיה ישראלית, יא, 87-116. https://cris.haifa.ac.il/en/publications/לסלוח-או-לא-לסלוח-סליחה-דיאלוגית-על-פגיעות-מיניות-בתהליכי-צדק-מאח</w:t>
+        <w:t>הדר, נ' וגל, ט' (2023). "הרגשתי איך תופרים לי את הלב": החוויה הרגשית של נפגעות אלימות מינית בעקבות תהליכי צדק מאחה. חברה ורווחה, מג(3), 355-375. https://www.gov.il/BlobFolder/reports/molsa-43-3-nataly-h/he/SocialAndWelfareMagazine_Magazine-43-3_43-3-NATALY-H.pdf</w:t>
       </w:r>
     </w:p>
     <w:p>
@@ -939,7 +904,7 @@
           <w:sz w:val="24"/>
           <w:szCs w:val="24"/>
         </w:rPr>
-        <w:t>קלר-חלמיש, כ' ופלג-קוריאט, ע' (2020). ממחאה לאיחוי: מחאת #MeToo כרקע לפיתוח והנגשה של תהליכי צדק מאחה במקרים של פגיעה מינית. קרימינולוגיה ישראלית, ט, 33-53. https://papers.ssrn.com/sol3/papers.cfm?abstract_id=3901353</w:t>
+        <w:t>קלר-חלמיש, כ' ופלג-קוריאט, ע' (2020). ממחאה לאיחוי: מחאת #MeToo כרקע לפיתוח ולהנגשה של תהליכי צדק מאחה במקרים של פגיעה מינית. קרימינולוגיה ישראלית, ט, 33-53. https://papers.ssrn.com/sol3/papers.cfm?abstract_id=3901353</w:t>
       </w:r>
     </w:p>
     <w:p>
@@ -957,7 +922,7 @@
           <w:sz w:val="24"/>
           <w:szCs w:val="24"/>
         </w:rPr>
-        <w:t>Bernburg, J. G. (2019). Labeling theory. In M. D. Krohn, N. Hendrix, G. Penly Hall, &amp; A. J. Lizotte (Eds.), Handbook on crime and deviance (2nd ed., pp. 179-196). Springer. https://www.researchgate.net/publication/336312509_LABELING_THEORY</w:t>
+        <w:t>Bernburg, J. G. (2019). Labeling theory. In M. D. Krohn, N. Hendrix, G. Penly Hall, &amp; A. J. Lizotte (Eds.), Handbook on crime and deviance (2nd ed., pp. 179-196). Springer. https://doi.org/10.1007/978-3-030-20779-3_10</w:t>
       </w:r>
     </w:p>
     <w:p>
@@ -975,61 +940,7 @@
           <w:sz w:val="24"/>
           <w:szCs w:val="24"/>
         </w:rPr>
-        <w:t>Clay-Warner, J., &amp; Edgemon, T. G. (2020). Feminist approaches to victimology. In S. Walklate, K. Fitz-Gibbon, J. Maher, &amp; J. McCulloch (Eds.), The Emerald handbook of feminism, criminology and social change (pp. 35-50). Emerald Publishing. https://research.birmingham.ac.uk/en/publications/feminist-approaches-to-victimology/</w:t>
-      </w:r>
-    </w:p>
-    <w:p>
-      <w:pPr>
-        <w:spacing w:lineRule="auto" w:line="360" w:after="160" w:before="0"/>
-        <w:ind w:left="709" w:hanging="709"/>
-        <w:jc w:val="left"/>
-        <w:bidi w:val="0"/>
-      </w:pPr>
-      <w:r>
-        <w:rPr>
-          <w:rFonts w:ascii="David" w:hAnsi="David" w:cs="David" w:eastAsia="David"/>
-          <w:b w:val="0"/>
-          <w:i w:val="0"/>
-          <w:sz w:val="24"/>
-          <w:szCs w:val="24"/>
-        </w:rPr>
-        <w:t>Fulham, L., Blais, J., Rugge, T., &amp; Schultheis, E. A. (2025). The effectiveness of restorative justice programs: A meta-analysis of recidivism and other relevant outcomes. Criminology &amp; Criminal Justice, 25(5), 1486-1512. https://doi.org/10.1177/17488958231215228</w:t>
-      </w:r>
-    </w:p>
-    <w:p>
-      <w:pPr>
-        <w:spacing w:lineRule="auto" w:line="360" w:after="160" w:before="0"/>
-        <w:ind w:left="709" w:hanging="709"/>
-        <w:jc w:val="left"/>
-        <w:bidi w:val="0"/>
-      </w:pPr>
-      <w:r>
-        <w:rPr>
-          <w:rFonts w:ascii="David" w:hAnsi="David" w:cs="David" w:eastAsia="David"/>
-          <w:b w:val="0"/>
-          <w:i w:val="0"/>
-          <w:sz w:val="24"/>
-          <w:szCs w:val="24"/>
-        </w:rPr>
-        <w:t>Kimbrell, C. S., Wilson, D. B., &amp; Olaghere, A. (2023). Restorative justice programs and practices in juvenile justice: An updated systematic review and meta-analysis for effectiveness. Criminology &amp; Public Policy, 22(1), 161-195. https://doi.org/10.1111/1745-9133.12613</w:t>
-      </w:r>
-    </w:p>
-    <w:p>
-      <w:pPr>
-        <w:spacing w:lineRule="auto" w:line="360" w:after="160" w:before="0"/>
-        <w:ind w:left="709" w:hanging="709"/>
-        <w:jc w:val="left"/>
-        <w:bidi w:val="0"/>
-      </w:pPr>
-      <w:r>
-        <w:rPr>
-          <w:rFonts w:ascii="David" w:hAnsi="David" w:cs="David" w:eastAsia="David"/>
-          <w:b w:val="0"/>
-          <w:i w:val="0"/>
-          <w:sz w:val="24"/>
-          <w:szCs w:val="24"/>
-        </w:rPr>
-        <w:t>Peleg-Koriat, I. (2025). Ethnic differences in support for restorative justice in sexual abuse cases: The role of offense severity and malleability beliefs. Violence Against Women. Advance online publication. https://pmc.ncbi.nlm.nih.gov/articles/PMC13031375/</w:t>
+        <w:t>Peleg-Koriat, I. (2026). Ethnic differences in support for restorative justice in sexual abuse cases: The role of offense severity and malleability beliefs. Violence Against Women, 32(6-7), 1901-1923. https://doi.org/10.1177/10778012251347588</w:t>
       </w:r>
     </w:p>
     <w:p>
@@ -1065,7 +976,7 @@
           <w:sz w:val="24"/>
           <w:szCs w:val="24"/>
         </w:rPr>
-        <w:t>Van Dijk, J. (2020). Victim labeling theory: A reappraisal. In J. Joseph &amp; S. Jergenson (Eds.), An international perspective on contemporary developments in victimology: A festschrift in honor of Marc Groenhuijsen (pp. 73-90). Springer. https://www.researchgate.net/publication/342546073_Victim_Labeling_Theory_A_Reappraisal</w:t>
+        <w:t>Van Dijk, J. (2020). Victim labeling theory: A reappraisal. In J. Joseph &amp; S. Jergenson (Eds.), An international perspective on contemporary developments in victimology: A festschrift in honor of Marc Groenhuijsen (pp. 73-90). Springer. https://doi.org/10.1007/978-3-030-41622-5_6</w:t>
       </w:r>
     </w:p>
     <w:p>

</xml_diff>

<commit_message>
Trim section B under the 700-word limit
Co-Authored-By: Claude Fable 5.1 <noreply@anthropic.com>
Claude-Session: https://claude.ai/code/session_01As7S69NaLZWPi9WH4jd1cV
</commit_message>
<xml_diff>
--- a/papers/restorative-justice-summary-paper.docx
+++ b/papers/restorative-justice-summary-paper.docx
@@ -516,7 +516,7 @@
           <w:sz w:val="24"/>
           <w:szCs w:val="24"/>
         </w:rPr>
-        <w:t>צדק מאחה נולד מתוך ביקורת זו. בריית'ווייט טען שבחברות קהילתניות הגינוי המוסרי, הבִּיוּש, מלווה במאמצים להשיב את הפוגע לקהילה דרך סליחה, שמירה על הקשרים וטקסים המסמנים שהוא אינו עוד סוטה, ואילו בחברות אינדיבידואליסטיות הביוש מסתיים בסטיגמה, ולכן התיוג הפורמלי בהן קרימינוגני יותר (Braithwaite, 1989, כפי שמצוטט אצל Bernburg, 2019). המפגש המאחה הוא הגלמה מוסדית של הרעיון: הפוגע עומד מול הנזק בנוכחות אנשים שחשובים לו, מקבל אחריות, ומתקבל בחזרה לקהילה בתום ההליך. הנפגעות עצמן ציפו שהפוגע ייקח אחריות במפגש, ותומך של נפגע תיאר את כוחה של הקהילה להיות מגוננת ולהתמודד עם הפוגע בעת ובעונה אחת (הדר וגל, 2023: 364-367).</w:t>
+        <w:t>צדק מאחה נולד מתוך ביקורת זו. בריית'ווייט טען שבחברות קהילתניות הגינוי המוסרי, הבִּיוּש, מלווה במאמצים להשיב את הפוגע לקהילה דרך סליחה, שמירה על הקשרים וטקסים המסמנים שהוא אינו עוד סוטה, ואילו בחברות אינדיבידואליסטיות הביוש מסתיים בסטיגמה והתיוג הפורמלי קרימינוגני יותר (Braithwaite, 1989, כפי שמצוטט אצל Bernburg, 2019). המפגש המאחה הוא הגלמה מוסדית של הרעיון: הפוגע עומד מול הנזק בנוכחות אנשים שחשובים לו, מקבל אחריות, ומתקבל בחזרה לקהילה בתום ההליך. הנפגעות עצמן ציפו שהפוגע ייקח אחריות במפגש, ותומך של נפגע תיאר את כוחה של הקהילה להיות מגוננת ולהתמודד עם הפוגע בעת ובעונה אחת (הדר וגל, 2023: 364-367).</w:t>
       </w:r>
     </w:p>
     <w:p>
@@ -578,7 +578,7 @@
           <w:sz w:val="24"/>
           <w:szCs w:val="24"/>
         </w:rPr>
-        <w:t xml:space="preserve"> הגישה השנייה בוחנת את הנושא מכיוון מנוגד, מנקודת מבטה של הנפגעת ושל יחסי הכוח הממוגדרים סביבה. המאבק הפמיניסטי של שלושים השנים האחרונות שינה חוקים ונהלים, אך לא את חוויית הנפגעות בהליך הפלילי, שמתמקד בנאשם ולא בהן. הספרות מכנה את המסע שהן עוברות בו "אונס שני": חוסר אמון, זלזול, פקפוק בחוויותיהן, והפיכתן לאובייקט כפי שנעשה להן בעת הפגיעה, כלומר קורבנות משנית (קלר-חלמיש ופלג-קוריאט, 2020: 37-38). מול זה עומדים צורכי הצדק וההחלמה של הנפגעות: תחושת ביטחון והטלת האחריות על הפוגע, קבלת תשובות, איחוי מערכות היחסים, ואיחוי תחושת העצמי והפסקת ההאשמה העצמית (קלר-חלמיש ופלג-קוריאט, 2020: 37).</w:t>
+        <w:t xml:space="preserve"> הגישה השנייה בוחנת את הנושא מנקודת מבטה של הנפגעת ושל יחסי הכוח הממוגדרים סביבה. המאבק הפמיניסטי של שלושים השנים האחרונות שינה חוקים ונהלים, אך לא את חוויית הנפגעות בהליך הפלילי, שמתמקד בנאשם ולא בהן. הספרות מכנה את המסע שהן עוברות בו "אונס שני": חוסר אמון, זלזול, פקפוק בחוויותיהן, והפיכתן לאובייקט כפי שנעשה להן בעת הפגיעה, כלומר קורבנות משנית (קלר-חלמיש ופלג-קוריאט, 2020: 37-38). מול זה עומדים צורכי הצדק וההחלמה של הנפגעות: תחושת ביטחון והטלת האחריות על הפוגע, קבלת תשובות, איחוי מערכות היחסים, ואיחוי תחושת העצמי והפסקת ההאשמה העצמית (קלר-חלמיש ופלג-קוריאט, 2020: 37).</w:t>
       </w:r>
     </w:p>
     <w:p>

</xml_diff>

<commit_message>
Trim section B to fit the word limit
Co-Authored-By: Claude Fable 5.1 <noreply@anthropic.com>
Claude-Session: https://claude.ai/code/session_01As7S69NaLZWPi9WH4jd1cV
</commit_message>
<xml_diff>
--- a/papers/restorative-justice-summary-paper.docx
+++ b/papers/restorative-justice-summary-paper.docx
@@ -516,7 +516,7 @@
           <w:sz w:val="24"/>
           <w:szCs w:val="24"/>
         </w:rPr>
-        <w:t>צדק מאחה נולד מתוך ביקורת זו. בריית'ווייט טען שבחברות קהילתניות הגינוי המוסרי, הבִּיוּש, מלווה במאמצים להשיב את הפוגע לקהילה דרך סליחה, שמירה על הקשרים וטקסים המסמנים שהוא אינו עוד סוטה, ואילו בחברות אינדיבידואליסטיות הביוש מסתיים בסטיגמה והתיוג הפורמלי קרימינוגני יותר (Braithwaite, 1989, כפי שמצוטט אצל Bernburg, 2019). המפגש המאחה הוא הגלמה מוסדית של הרעיון: הפוגע עומד מול הנזק בנוכחות אנשים שחשובים לו, מקבל אחריות, ומתקבל בחזרה לקהילה בתום ההליך. הנפגעות עצמן ציפו שהפוגע ייקח אחריות במפגש, ותומך של נפגע תיאר את כוחה של הקהילה להיות מגוננת ולהתמודד עם הפוגע בעת ובעונה אחת (הדר וגל, 2023: 364-367).</w:t>
+        <w:t>צדק מאחה נולד מתוך ביקורת זו. בריית'ווייט טען שבחברות קהילתניות הגינוי המוסרי, הבִּיוּש, מלווה במאמצים להשיב את הפוגע לקהילה דרך סליחה, שמירה על הקשרים וטקסים המסמנים שהוא אינו עוד סוטה, ואילו בחברות אינדיבידואליסטיות הביוש מסתיים בסטיגמה והתיוג הפורמלי קרימינוגני יותר (Braithwaite, 1989, כפי שמצוטט אצל Bernburg, 2019). המפגש המאחה הוא הגלמה מוסדית של הרעיון: הפוגע עומד מול הנזק בנוכחות אנשים שחשובים לו, מקבל אחריות, ומתקבל בחזרה לקהילה בתום ההליך. הנפגעות עצמן ציפו שהפוגע ייקח אחריות במפגש, ותומך של נפגע תיאר את כוחה של הקהילה להיות מגוננת ולהתמודד עם הפוגע גם יחד (הדר וגל, 2023: 364-367).</w:t>
       </w:r>
     </w:p>
     <w:p>
@@ -550,7 +550,7 @@
           <w:sz w:val="24"/>
           <w:szCs w:val="24"/>
         </w:rPr>
-        <w:t>יחסיות הסטייה ניכרת גם בשאלה מי נחשב ראוי להליך מאחה. בשני ניסויים שנערכו בישראל, עם 446 ו-560 משתתפים, נמצאה הטיה אתנית מובהקת בתמיכה בצדק מאחה לפי זהותם של הפוגע, הנפגע והמשיב, חזקה יותר בעבירות על רקע פוליטי מאשר בעבירות פליליות רגילות, ומתווכת במלואה דרך האמונה ביכולתו של הפוגע להשתנות (Peleg-Koriat et al., 2025). אותו מעשה נתפס כניתן לתיקון או לא לפי מי שביצע אותו, וההחלטה מי יופנה להליך מאחה ומי לענישה היא עצמה תגובה חברתית מתייגת.</w:t>
+        <w:t>יחסיות הסטייה ניכרת גם בשאלה מי נחשב ראוי להליך מאחה. בשני ניסויים שנערכו בישראל, עם 446 ו-560 משתתפים, נמצאה הטיה אתנית מובהקת בתמיכה בצדק מאחה לפי זהותם של הפוגע, הנפגע והמשיב, חזקה יותר בעבירות על רקע פוליטי מאשר בעבירות פליליות רגילות, ומתווכת דרך האמונה שהפוגע יכול להשתנות (Peleg-Koriat et al., 2025). אותו מעשה נתפס כניתן לתיקון או לא לפי מי שביצע אותו, וההחלטה מי יופנה להליך מאחה ומי לענישה היא עצמה תגובה חברתית מתייגת.</w:t>
       </w:r>
     </w:p>
     <w:p>
@@ -595,7 +595,7 @@
           <w:sz w:val="24"/>
           <w:szCs w:val="24"/>
         </w:rPr>
-        <w:t>התגובה החברתית לנפגע עצמו ממוגדרת אף היא. ניתוח של 1,890 תגובות גולשים לחשיפות של נפגעי פגיעה מינית במסגרת #MeToo בישראל מצא שרק 1.1% מהתגובות היו לא תומכות, אך נשים זכו לתמיכה רגשית ורשתית רבה יותר מגברים, ואילו גברים קיבלו יותר תמיכה מעריכה, דפוס המבטא סטריאוטיפים מגדריים כלפי קורבנותם (לוינשטיין-ברקאי, 2020). זו הסיבה שהגישה הפמיניסטית מתנגדת לדמות "הקורבן האידיאלי" ודורשת הכרה גם במי שאינו תואם אותה. אך גם צדק מאחה חשוד בעיניה, בשל מאפייניה הייחודיים של הפגיעה המינית: הבושה, הטאבו, הפגיעה הרגשית המוגברת, החשש לביטחון והפגיעה באמון הבסיסי, שכן רוב הפוגעים מוכרים לנפגעת. קלר-חלמיש ופלג-קוריאט (2020) טוענות שמחאת #MeToo חשפה את כישלון ההליך הפלילי, ולכן יש להנגיש צדק מאחה לפגיעות מיניות בתנאים מגוננים: וולונטריות מלאה לכל הצדדים, הכנה מעמיקה, מנחים בעלי מומחיות וקריטריונים ברורים להתאמת המקרה (עמ' 43-45). ממצאי הראיונות תומכים בעמדה זו. הנפגעות תיארו את ההליך כחוויה של החזרת שליטה ואוטונומיה, שכן הן מובילות אותו ומחליטות על כל פרט בו (הדר וגל, 2023: 369-370).</w:t>
+        <w:t>התגובה החברתית לנפגע עצמו ממוגדרת אף היא. ניתוח של 1,890 תגובות גולשים לחשיפות של נפגעי פגיעה מינית במסגרת #MeToo בישראל מצא שרק 1.1% מהתגובות היו לא תומכות, אך נשים זכו לתמיכה רגשית ורשתית רבה יותר מגברים, ואילו גברים קיבלו יותר תמיכה מעריכה, דפוס המבטא סטריאוטיפים מגדריים (לוינשטיין-ברקאי, 2020). זו הסיבה שהגישה הפמיניסטית מתנגדת לדמות "הקורבן האידיאלי" ודורשת הכרה גם במי שאינו תואם אותה. אך גם צדק מאחה חשוד בעיניה, בשל מאפייניה הייחודיים של הפגיעה המינית: הבושה, הטאבו, הפגיעה הרגשית המוגברת, החשש לביטחון והפגיעה באמון הבסיסי, שכן רוב הפוגעים מוכרים לנפגעת. קלר-חלמיש ופלג-קוריאט (2020) טוענות שמחאת #MeToo חשפה את כישלון ההליך הפלילי, ולכן יש להנגיש צדק מאחה לפגיעות מיניות בתנאים מגוננים: וולונטריות מלאה לכל הצדדים, הכנה מעמיקה, מנחים בעלי מומחיות וקריטריונים ברורים להתאמת המקרה (עמ' 43-45). ממצאי הראיונות תומכים בעמדה זו. הנפגעות תיארו את ההליך כחוויה של החזרת שליטה ואוטונומיה, שכן הן מובילות אותו ומחליטות על כל פרט בו (הדר וגל, 2023: 369-370).</w:t>
       </w:r>
     </w:p>
     <w:p>

</xml_diff>

<commit_message>
Cite the course presentation for concepts learned in class
Co-Authored-By: Claude Fable 5.1 <noreply@anthropic.com>
Claude-Session: https://claude.ai/code/session_01As7S69NaLZWPi9WH4jd1cV
</commit_message>
<xml_diff>
--- a/papers/restorative-justice-summary-paper.docx
+++ b/papers/restorative-justice-summary-paper.docx
@@ -419,7 +419,7 @@
           <w:sz w:val="24"/>
           <w:szCs w:val="24"/>
         </w:rPr>
-        <w:t>צדק מאחה הוא גישה לתגובה חברתית לפשיעה הרואה בעבירה בראש ובראשונה פגיעה בבני אדם וביחסים שביניהם, ולא רק הפרה של חוק המדינה. השאלה אינה איזה חוק הופר אלא מי נפגע ומי אחראי לתיקון. ליבת ההליך היא מפגש מונחה בין הנפגע לפוגע, לעיתים בנוכחות תומכים ונציגי קהילה, שבו הפוגע מקבל אחריות על מעשיו והצדדים מגבשים יחד הסכם לתיקון הנזק (קלר-חלמיש ופלג-קוריאט, 2020).</w:t>
+        <w:t>צדק מאחה הוא גישה לתגובה חברתית לפשיעה הרואה בעבירה בראש ובראשונה פגיעה בבני אדם וביחסים שביניהם, ולא רק הפרה של חוק המדינה. השאלה אינה איזה חוק הופר אלא מי נפגע ומי אחראי לתיקון. ליבת ההליך היא מפגש מונחה בין הנפגע לפוגע, לעיתים בנוכחות תומכים ונציגי קהילה, שבו הפוגע מקבל אחריות על מעשיו והצדדים מגבשים יחד הסכם לתיקון הנזק (קלר-חלמיש ופלג-קוריאט, 2020). כפי שנלמד בקורס, ההליך מתקיים בחסות רשויות החוק ונועד להחליף או להשלים את ההליך הפלילי, ושיח מאחה משמש גם בקבוצות קונפליקט כמו יהודים וערבים (פרנקו גלאור, 2025).</w:t>
       </w:r>
     </w:p>
     <w:p>
@@ -499,7 +499,7 @@
           <w:sz w:val="24"/>
           <w:szCs w:val="24"/>
         </w:rPr>
-        <w:t xml:space="preserve"> נקודת המוצא של תיאוריית התיוג היא יחסיות הסטייה: אין מעשה סוטה כשלעצמו, אלא מעשה שהחברה הגיבה עליו והגדירה אותו ככזה. התגובה החברתית לפשיעה, ובעיקר זו הפורמלית של משטרה ובית משפט, מדביקה לאדם תווית של "עבריין" המעצבת את זהותו ואת יחסם של אחרים אליו. כאן עוברת ההבחנה בין עבריינות ראשונית, מעשה ראשון בעל גורמים מזדמנים, לבין עבריינות משנית, שבה הסטייה נעשית לאמצעי הגנה או הסתגלות לבעיות שהתיוג עצמו יצר (Lemert, 1967, כפי שמצוטט אצל Bernburg, 2019). סקירת המחקר העדכני מזהה שלושה תהליכים שדרכם תיוג פלילי רשמי מגדיל את הסיכוי לעבריינות בהמשך: גיבוש תפיסה עצמית סוטה, הדרה חברתית שבה מורים, מעסיקים ובני קהילה דוחים את המתויג והוא עצמו נסוג מהם מחשש לדחייה, והשתקעות בקבוצות עברייניות שבהן התווית אינה מכשול אלא יתרון. מיעוטים ועניים פגיעים יותר לתיוג בשל סטריאוטיפים הקושרים אותם לפשיעה (Bernburg, 2019).</w:t>
+        <w:t xml:space="preserve"> נקודת המוצא של תיאוריית התיוג, כפי שהוצגה בקורס, היא שהבעיה אינה ההתנהגות עצמה אלא התגובה החברתית אליה: אדם נהפך לעבריין או לקורבן כאשר החברה מגדירה אותו כך (פרנקו גלאור, 2025). התגובה החברתית לפשיעה, ובעיקר זו הפורמלית של משטרה ובית משפט, מדביקה לאדם תווית של "עבריין" המעצבת את זהותו ואת יחסם של אחרים אליו. כאן עוברת ההבחנה בין עבריינות ראשונית, מעשה ראשון בעל גורמים מזדמנים, לבין עבריינות משנית, שבה הסטייה נעשית לאמצעי הגנה או הסתגלות לבעיות שהתיוג עצמו יצר (Lemert, 1967, כפי שמצוטט אצל Bernburg, 2019). סקירת המחקר העדכני מזהה שלושה תהליכים שדרכם תיוג פלילי רשמי מגדיל את הסיכוי לעבריינות בהמשך: גיבוש תפיסה עצמית סוטה, הדרה חברתית שבה מורים, מעסיקים ובני קהילה דוחים את המתויג והוא עצמו נסוג מהם מחשש לדחייה, והשתקעות בקבוצות עברייניות שבהן התווית אינה מכשול אלא יתרון. מיעוטים ועניים פגיעים יותר לתיוג בשל סטריאוטיפים הקושרים אותם לפשיעה (Bernburg, 2019).</w:t>
       </w:r>
     </w:p>
     <w:p>
@@ -516,7 +516,7 @@
           <w:sz w:val="24"/>
           <w:szCs w:val="24"/>
         </w:rPr>
-        <w:t>צדק מאחה נולד מתוך ביקורת זו. בריית'ווייט טען שבחברות קהילתניות הגינוי המוסרי, הבִּיוּש, מלווה במאמצים להשיב את הפוגע לקהילה דרך סליחה, שמירה על הקשרים וטקסים המסמנים שהוא אינו עוד סוטה, ואילו בחברות אינדיבידואליסטיות הביוש מסתיים בסטיגמה והתיוג הפורמלי קרימינוגני יותר (Braithwaite, 1989, כפי שמצוטט אצל Bernburg, 2019). המפגש המאחה הוא הגלמה מוסדית של הרעיון: הפוגע עומד מול הנזק בנוכחות אנשים שחשובים לו, מקבל אחריות, ומתקבל בחזרה לקהילה בתום ההליך. הנפגעות עצמן ציפו שהפוגע ייקח אחריות במפגש, ותומך של נפגע תיאר את כוחה של הקהילה להיות מגוננת ולהתמודד עם הפוגע גם יחד (הדר וגל, 2023: 364-367).</w:t>
+        <w:t>צדק מאחה נולד מתוך ביקורת זו. בריית'ווייט טען שבחברות קהילתניות הגינוי המוסרי, הבִּיוּש, מלווה במאמצים להשיב את הפוגע לקהילה דרך סליחה, שמירה על הקשרים וטקסים המסמנים שהוא אינו עוד סוטה, ואילו בחברות אינדיבידואליסטיות הביוש מסתיים בסטיגמה והתיוג הפורמלי קרימינוגני יותר (Braithwaite, 1989, כפי שמצוטט אצל Bernburg, 2019). המפגש המאחה הוא הגלמה מוסדית של הרעיון: הפוגע עומד מול הנזק בנוכחות אנשים שחשובים לו, מקבל אחריות, ומתקבל בחזרה לקהילה בתום ההליך.</w:t>
       </w:r>
     </w:p>
     <w:p>
@@ -533,7 +533,7 @@
           <w:sz w:val="24"/>
           <w:szCs w:val="24"/>
         </w:rPr>
-        <w:t>תיאוריית התיוג חלה גם על הנפגע. ואן דייק מראה שהמילה "קורבן" בשפות המערב נגזרת מן המילה הלטינית לבעל חיים המוקרב, בעוד שבסינית וביפנית מכונה הנפגע במונח ניטרלי, "מי שספג את הנזק". התווית נושאת קונוטציה של סבל פסיבי וחוסר אונים, ומי שמסרב לה ומציג את עצמו כשורד חזק מעורר לעיתים עוינות (Van Dijk, 2020: 74-76). ניסוי שבו תוארה אותה אישה פעם כ"קורבן" ופעם כ"שורדת" של אונס מצא שהמילה "קורבן" גרמה למשיבים לתפוס אותה כחלשה, פסיבית ותמימה יותר (Papendick &amp; Bohner, 2017, כפי שמצוטט אצל Van Dijk, 2020). ההליך הפלילי מקבע את התווית, שכן הנפגע הוא בו עד ולא צד. צדק מאחה מציע מסלול הפוך: הנפגע בוחר, מדבר בקולו ומעצב את הסכם התיקון.</w:t>
+        <w:t>תיאוריית התיוג חלה גם על הנפגע. ואן דייק מראה שהמילה "קורבן" בשפות המערב נגזרת מן המילה הלטינית לבעל חיים המוקרב, בעוד שבסינית וביפנית מכונה הנפגע במונח ניטרלי, "מי שספג את הנזק". התווית נושאת קונוטציה של סבל פסיבי וחוסר אונים (Van Dijk, 2020: 74-76). ניסוי שבו תוארה אותה אישה פעם כ"קורבן" ופעם כ"שורדת" של אונס מצא שהמילה "קורבן" גרמה למשיבים לתפוס אותה כחלשה, פסיבית ותמימה יותר (Papendick &amp; Bohner, 2017, כפי שמצוטט אצל Van Dijk, 2020). ההליך הפלילי מקבע את התווית, שכן הנפגע הוא בו עד ולא צד. צדק מאחה מציע מסלול הפוך: הנפגע בוחר, מדבר בקולו ומעצב את הסכם התיקון.</w:t>
       </w:r>
     </w:p>
     <w:p>
@@ -550,7 +550,7 @@
           <w:sz w:val="24"/>
           <w:szCs w:val="24"/>
         </w:rPr>
-        <w:t>יחסיות הסטייה ניכרת גם בשאלה מי נחשב ראוי להליך מאחה. בשני ניסויים שנערכו בישראל, עם 446 ו-560 משתתפים, נמצאה הטיה אתנית מובהקת בתמיכה בצדק מאחה לפי זהותם של הפוגע, הנפגע והמשיב, חזקה יותר בעבירות על רקע פוליטי מאשר בעבירות פליליות רגילות, ומתווכת דרך האמונה שהפוגע יכול להשתנות (Peleg-Koriat et al., 2025). אותו מעשה נתפס כניתן לתיקון או לא לפי מי שביצע אותו, וההחלטה מי יופנה להליך מאחה ומי לענישה היא עצמה תגובה חברתית מתייגת.</w:t>
+        <w:t>יחסיות הסטייה ניכרת גם בשאלות שהקורס מציב: מי מגדיר, את מי, ובאילו נסיבות התיוג נתפס כלגיטימי (פרנקו גלאור, 2025). בשני ניסויים שנערכו בישראל, עם 446 ו-560 משתתפים, נמצאה הטיה אתנית מובהקת בתמיכה בצדק מאחה לפי זהותם של הפוגע, הנפגע והמשיב, חזקה יותר בעבירות על רקע פוליטי מאשר בעבירות פליליות רגילות, ומתווכת דרך האמונה שהפוגע יכול להשתנות (Peleg-Koriat et al., 2025). אותו מעשה נתפס כניתן לתיקון או לא לפי מי שביצע אותו, וההחלטה מי יופנה להליך מאחה ומי לענישה היא עצמה תגובה חברתית מתייגת.</w:t>
       </w:r>
     </w:p>
     <w:p>
@@ -578,7 +578,7 @@
           <w:sz w:val="24"/>
           <w:szCs w:val="24"/>
         </w:rPr>
-        <w:t xml:space="preserve"> הגישה השנייה בוחנת את הנושא מנקודת מבטה של הנפגעת ושל יחסי הכוח הממוגדרים סביבה. המאבק הפמיניסטי של שלושים השנים האחרונות שינה חוקים ונהלים, אך לא את חוויית הנפגעות בהליך הפלילי, שמתמקד בנאשם ולא בהן. הספרות מכנה את המסע שהן עוברות בו "אונס שני": חוסר אמון, זלזול, פקפוק בחוויותיהן, והפיכתן לאובייקט כפי שנעשה להן בעת הפגיעה, כלומר קורבנות משנית (קלר-חלמיש ופלג-קוריאט, 2020: 37-38). מול זה עומדים צורכי הצדק וההחלמה של הנפגעות: תחושת ביטחון והטלת האחריות על הפוגע, קבלת תשובות, איחוי מערכות היחסים, ואיחוי תחושת העצמי והפסקת ההאשמה העצמית (קלר-חלמיש ופלג-קוריאט, 2020: 37).</w:t>
+        <w:t xml:space="preserve"> הוויקטימולוגיה הפמיניסטית, כפי שנלמדה בקורס, מבקשת לחשוף ולבקר את האופן שבו מוסדות חברתיים ומשפטיים מתייחסים לנפגעות, ולעיתים משעתקים את הפגיעה בהן (פרנקו גלאור, 2025). המאבק הפמיניסטי של שלושים השנים האחרונות שינה חוקים ונהלים, אך לא את חוויית הנפגעות בהליך הפלילי, שמתמקד בנאשם ולא בהן. הספרות מכנה את המסע שהן עוברות בו "אונס שני": חוסר אמון, זלזול, פקפוק בחוויותיהן, והפיכתן לאובייקט כפי שנעשה להן בעת הפגיעה, כלומר קורבנות משנית (קלר-חלמיש ופלג-קוריאט, 2020: 37-38). מול זה עומדים צורכי הצדק וההחלמה של הנפגעות: תחושת ביטחון והטלת האחריות על הפוגע, קבלת תשובות, איחוי מערכות היחסים, ואיחוי תחושת העצמי והפסקת ההאשמה העצמית (קלר-חלמיש ופלג-קוריאט, 2020: 37).</w:t>
       </w:r>
     </w:p>
     <w:p>
@@ -595,7 +595,7 @@
           <w:sz w:val="24"/>
           <w:szCs w:val="24"/>
         </w:rPr>
-        <w:t>התגובה החברתית לנפגע עצמו ממוגדרת אף היא. ניתוח של 1,890 תגובות גולשים לחשיפות של נפגעי פגיעה מינית במסגרת #MeToo בישראל מצא שרק 1.1% מהתגובות היו לא תומכות, אך נשים זכו לתמיכה רגשית ורשתית רבה יותר מגברים, ואילו גברים קיבלו יותר תמיכה מעריכה, דפוס המבטא סטריאוטיפים מגדריים (לוינשטיין-ברקאי, 2020). זו הסיבה שהגישה הפמיניסטית מתנגדת לדמות "הקורבן האידיאלי" ודורשת הכרה גם במי שאינו תואם אותה. אך גם צדק מאחה חשוד בעיניה, בשל מאפייניה הייחודיים של הפגיעה המינית: הבושה, הטאבו, הפגיעה הרגשית המוגברת, החשש לביטחון והפגיעה באמון הבסיסי, שכן רוב הפוגעים מוכרים לנפגעת. קלר-חלמיש ופלג-קוריאט (2020) טוענות שמחאת #MeToo חשפה את כישלון ההליך הפלילי, ולכן יש להנגיש צדק מאחה לפגיעות מיניות בתנאים מגוננים: וולונטריות מלאה לכל הצדדים, הכנה מעמיקה, מנחים בעלי מומחיות וקריטריונים ברורים להתאמת המקרה (עמ' 43-45). ממצאי הראיונות תומכים בעמדה זו. הנפגעות תיארו את ההליך כחוויה של החזרת שליטה ואוטונומיה, שכן הן מובילות אותו ומחליטות על כל פרט בו (הדר וגל, 2023: 369-370).</w:t>
+        <w:t>התגובה החברתית לנפגע עצמו ממוגדרת אף היא. ניתוח של 1,890 תגובות גולשים לחשיפות של נפגעי פגיעה מינית במסגרת #MeToo בישראל מצא שרק 1.1% מהתגובות היו לא תומכות, אך נשים זכו לתמיכה רגשית ורשתית רבה יותר מגברים, ואילו גברים קיבלו יותר תמיכה מעריכה, דפוס המבטא סטריאוטיפים מגדריים (לוינשטיין-ברקאי, 2020). זו הסיבה שהגישה הפמיניסטית מתנגדת לדמות "הקורבן האידיאלי" ודורשת הכרה גם במי שאינו תואם אותה (פרנקו גלאור, 2025). אך גם צדק מאחה חשוד בעיניה, בשל מאפייניה הייחודיים של הפגיעה המינית: הבושה, הטאבו, הפגיעה הרגשית המוגברת, החשש לביטחון והפגיעה באמון הבסיסי, שכן רוב הפוגעים מוכרים לנפגעת. קלר-חלמיש ופלג-קוריאט (2020) טוענות שמחאת #MeToo חשפה את כישלון ההליך הפלילי, ולכן יש להנגיש צדק מאחה לפגיעות מיניות בתנאים מגוננים: וולונטריות מלאה לכל הצדדים, הכנה מעמיקה, מנחים בעלי מומחיות וקריטריונים ברורים להתאמת המקרה (עמ' 43-45). ממצאי הראיונות תומכים בעמדה זו. הנפגעות תיארו את ההליך כחוויה של החזרת שליטה ואוטונומיה, שכן הן מובילות אותו ומחליטות על כל פרט בו (הדר וגל, 2023: 369-370).</w:t>
       </w:r>
     </w:p>
     <w:p>
@@ -831,7 +831,7 @@
           <w:sz w:val="24"/>
           <w:szCs w:val="24"/>
         </w:rPr>
-        <w:t>ההבדל הראשון הוא במעמד הטיעון. הקרימינולוגיה תיאורית ואמפירית, והיא בודקת מה ההליך עושה בפועל לנפגעות ולפוגעים (הדר וגל, 2023). היהדות נורמטיבית: היא אינה שואלת אם המפגש עובד אלא קובעת שהוא חובה. ההבדל השני, החריף יותר, נוגע לנפגע. הוויקטימולוגיה הפמיניסטית עומדת על כך שההליך חייב להיות וולונטרי לחלוטין ושהסליחה, אם תבוא, תצמח מתוך הדיאלוג ובקצב של הנפגעת (הדר וגל, 2023; קלר-חלמיש ופלג-קוריאט, 2020). ההלכה, לעומת זאת, מכנה סרבן מחילה "אכזרי". הסתירה מתמתנת כשמבחינים בין הליך לעמדה מוסרית: ההלכה אינה כופה מפגש, מתירה לפוגע להניח לנפגע לאחר שלוש פניות, ומכוונת את תביעתה אל תודעת הנפגע ולא אל בית הדין. תרומת הקרימינולוגיה היא הזהירות, כלומר ידע אמפירי על פערי כוח ועל תנאי ההצלחה של המפגש. תרומת היהדות היא התביעה המוסרית: הפוגע חייב לעמוד מול מי שפגע בו, והנפגע אינו רק מושא להגנה אלא סובייקט מוסרי בעל אחריות.</w:t>
+        <w:t>ההבדל הראשון הוא במעמד הטיעון. הקרימינולוגיה תיאורית ואמפירית, והיא בודקת מה ההליך עושה בפועל לנפגעות ולפוגעים (הדר וגל, 2023). היהדות נורמטיבית: היא אינה שואלת אם המפגש עובד אלא קובעת שהוא חובה. ההבדל השני, החריף יותר, נוגע לנפגע. הוויקטימולוגיה הפמיניסטית עומדת על וולונטריות מלאה (קלר-חלמיש ופלג-קוריאט, 2020), וכפי שנלמד בקורס, סליחה אינה יכולה להיות חובה מוסרית ואינה יכולה לבוא מבחוץ, אלא רק בקצב של הנפגעת, ובתרבויות של כבוד חובת הנקמה עשויה אף לגבור עליה (פרנקו גלאור, 2025). ההלכה, לעומת זאת, מכנה סרבן מחילה "אכזרי". הסתירה מתמתנת כשמבחינים בין הליך לעמדה מוסרית: ההלכה אינה כופה מפגש, מתירה לפוגע להניח לנפגע לאחר שלוש פניות, ומכוונת את תביעתה אל תודעת הנפגע ולא אל בית הדין. תרומת הקרימינולוגיה היא הזהירות, כלומר ידע אמפירי על פערי כוח ועל תנאי ההצלחה של המפגש. תרומת היהדות היא התביעה המוסרית: הפוגע חייב לעמוד מול מי שפגע בו, והנפגע אינו רק מושא להגנה אלא סובייקט מוסרי בעל אחריות.</w:t>
       </w:r>
     </w:p>
     <w:p>
@@ -887,6 +887,24 @@
           <w:szCs w:val="24"/>
         </w:rPr>
         <w:t>לוינשטיין-ברקאי, ה' (2020). המגדר כן קובע? תמיכה חברתית בקורבנות-גברים של פגיעה מינית לעומת תמיכה בקורבנות-נשים ברשתות חברתיות בישראל. מגמות, נה(2), 167-190. https://info2011.szold.org.il/PDF-Articles/megamot/113341.pdf</w:t>
+      </w:r>
+    </w:p>
+    <w:p>
+      <w:pPr>
+        <w:spacing w:lineRule="auto" w:line="360" w:after="160" w:before="0"/>
+        <w:ind w:left="709" w:hanging="709"/>
+        <w:jc w:val="right"/>
+        <w:bidi w:val="1"/>
+      </w:pPr>
+      <w:r>
+        <w:rPr>
+          <w:rFonts w:ascii="David" w:hAnsi="David" w:cs="David" w:eastAsia="David"/>
+          <w:b w:val="0"/>
+          <w:i w:val="0"/>
+          <w:sz w:val="24"/>
+          <w:szCs w:val="24"/>
+        </w:rPr>
+        <w:t>פרנקו גלאור, ה' (2025). ויקטימולוגיה בראייה רב-תחומית: העבריין, אכיפת החוק והקורבן [מצגת הרצאה]. הקורס ויקטימולוגיה בראייה רב-תרבותית, הקריה האקדמית אונו.</w:t>
       </w:r>
     </w:p>
     <w:p>

</xml_diff>

<commit_message>
Refer to course material in text without a bibliography entry
Co-Authored-By: Claude Fable 5.1 <noreply@anthropic.com>
Claude-Session: https://claude.ai/code/session_01As7S69NaLZWPi9WH4jd1cV
</commit_message>
<xml_diff>
--- a/papers/restorative-justice-summary-paper.docx
+++ b/papers/restorative-justice-summary-paper.docx
@@ -419,7 +419,7 @@
           <w:sz w:val="24"/>
           <w:szCs w:val="24"/>
         </w:rPr>
-        <w:t>צדק מאחה הוא גישה לתגובה חברתית לפשיעה הרואה בעבירה בראש ובראשונה פגיעה בבני אדם וביחסים שביניהם, ולא רק הפרה של חוק המדינה. השאלה אינה איזה חוק הופר אלא מי נפגע ומי אחראי לתיקון. ליבת ההליך היא מפגש מונחה בין הנפגע לפוגע, לעיתים בנוכחות תומכים ונציגי קהילה, שבו הפוגע מקבל אחריות על מעשיו והצדדים מגבשים יחד הסכם לתיקון הנזק (קלר-חלמיש ופלג-קוריאט, 2020). כפי שנלמד בקורס, ההליך מתקיים בחסות רשויות החוק ונועד להחליף או להשלים את ההליך הפלילי, ושיח מאחה משמש גם בקבוצות קונפליקט כמו יהודים וערבים (פרנקו גלאור, 2025).</w:t>
+        <w:t>צדק מאחה הוא גישה לתגובה חברתית לפשיעה הרואה בעבירה בראש ובראשונה פגיעה בבני אדם וביחסים שביניהם, ולא רק הפרה של חוק המדינה. השאלה אינה איזה חוק הופר אלא מי נפגע ומי אחראי לתיקון. ליבת ההליך היא מפגש מונחה בין הנפגע לפוגע, לעיתים בנוכחות תומכים ונציגי קהילה, שבו הפוגע מקבל אחריות על מעשיו והצדדים מגבשים יחד הסכם לתיקון הנזק (קלר-חלמיש ופלג-קוריאט, 2020). כפי שנלמד בקורס, ההליך מתקיים בחסות רשויות החוק ונועד להחליף או להשלים את ההליך הפלילי, ושיח מאחה משמש גם בקבוצות קונפליקט כמו יהודים וערבים.</w:t>
       </w:r>
     </w:p>
     <w:p>
@@ -499,7 +499,7 @@
           <w:sz w:val="24"/>
           <w:szCs w:val="24"/>
         </w:rPr>
-        <w:t xml:space="preserve"> נקודת המוצא של תיאוריית התיוג, כפי שהוצגה בקורס, היא שהבעיה אינה ההתנהגות עצמה אלא התגובה החברתית אליה: אדם נהפך לעבריין או לקורבן כאשר החברה מגדירה אותו כך (פרנקו גלאור, 2025). התגובה החברתית לפשיעה, ובעיקר זו הפורמלית של משטרה ובית משפט, מדביקה לאדם תווית של "עבריין" המעצבת את זהותו ואת יחסם של אחרים אליו. כאן עוברת ההבחנה בין עבריינות ראשונית, מעשה ראשון בעל גורמים מזדמנים, לבין עבריינות משנית, שבה הסטייה נעשית לאמצעי הגנה או הסתגלות לבעיות שהתיוג עצמו יצר (Lemert, 1967, כפי שמצוטט אצל Bernburg, 2019). סקירת המחקר העדכני מזהה שלושה תהליכים שדרכם תיוג פלילי רשמי מגדיל את הסיכוי לעבריינות בהמשך: גיבוש תפיסה עצמית סוטה, הדרה חברתית שבה מורים, מעסיקים ובני קהילה דוחים את המתויג והוא עצמו נסוג מהם מחשש לדחייה, והשתקעות בקבוצות עברייניות שבהן התווית אינה מכשול אלא יתרון. מיעוטים ועניים פגיעים יותר לתיוג בשל סטריאוטיפים הקושרים אותם לפשיעה (Bernburg, 2019).</w:t>
+        <w:t xml:space="preserve"> נקודת המוצא של תיאוריית התיוג, כפי שהוצגה בקורס, היא שהבעיה אינה ההתנהגות עצמה אלא התגובה החברתית אליה: אדם נהפך לעבריין או לקורבן כאשר החברה מגדירה אותו כך. התגובה החברתית לפשיעה, ובעיקר זו הפורמלית של משטרה ובית משפט, מדביקה לאדם תווית של "עבריין" המעצבת את זהותו ואת יחסם של אחרים אליו. כאן עוברת ההבחנה בין עבריינות ראשונית, מעשה ראשון בעל גורמים מזדמנים, לבין עבריינות משנית, שבה הסטייה נעשית לאמצעי הגנה או הסתגלות לבעיות שהתיוג עצמו יצר (Lemert, 1967, כפי שמצוטט אצל Bernburg, 2019). סקירת המחקר העדכני מזהה שלושה תהליכים שדרכם תיוג פלילי רשמי מגדיל את הסיכוי לעבריינות בהמשך: גיבוש תפיסה עצמית סוטה, הדרה חברתית שבה מורים, מעסיקים ובני קהילה דוחים את המתויג והוא עצמו נסוג מהם מחשש לדחייה, והשתקעות בקבוצות עברייניות שבהן התווית אינה מכשול אלא יתרון. מיעוטים ועניים פגיעים יותר לתיוג בשל סטריאוטיפים הקושרים אותם לפשיעה (Bernburg, 2019).</w:t>
       </w:r>
     </w:p>
     <w:p>
@@ -550,7 +550,7 @@
           <w:sz w:val="24"/>
           <w:szCs w:val="24"/>
         </w:rPr>
-        <w:t>יחסיות הסטייה ניכרת גם בשאלות שהקורס מציב: מי מגדיר, את מי, ובאילו נסיבות התיוג נתפס כלגיטימי (פרנקו גלאור, 2025). בשני ניסויים שנערכו בישראל, עם 446 ו-560 משתתפים, נמצאה הטיה אתנית מובהקת בתמיכה בצדק מאחה לפי זהותם של הפוגע, הנפגע והמשיב, חזקה יותר בעבירות על רקע פוליטי מאשר בעבירות פליליות רגילות, ומתווכת דרך האמונה שהפוגע יכול להשתנות (Peleg-Koriat et al., 2025). אותו מעשה נתפס כניתן לתיקון או לא לפי מי שביצע אותו, וההחלטה מי יופנה להליך מאחה ומי לענישה היא עצמה תגובה חברתית מתייגת.</w:t>
+        <w:t>יחסיות הסטייה ניכרת גם בשאלות שהקורס מציב: מי מגדיר, את מי, ובאילו נסיבות התיוג נתפס כלגיטימי. בשני ניסויים שנערכו בישראל, עם 446 ו-560 משתתפים, נמצאה הטיה אתנית מובהקת בתמיכה בצדק מאחה לפי זהותם של הפוגע, הנפגע והמשיב, חזקה יותר בעבירות על רקע פוליטי מאשר בעבירות פליליות רגילות, ומתווכת דרך האמונה שהפוגע יכול להשתנות (Peleg-Koriat et al., 2025). אותו מעשה נתפס כניתן לתיקון או לא לפי מי שביצע אותו, וההחלטה מי יופנה להליך מאחה ומי לענישה היא עצמה תגובה חברתית מתייגת.</w:t>
       </w:r>
     </w:p>
     <w:p>
@@ -578,7 +578,7 @@
           <w:sz w:val="24"/>
           <w:szCs w:val="24"/>
         </w:rPr>
-        <w:t xml:space="preserve"> הוויקטימולוגיה הפמיניסטית, כפי שנלמדה בקורס, מבקשת לחשוף ולבקר את האופן שבו מוסדות חברתיים ומשפטיים מתייחסים לנפגעות, ולעיתים משעתקים את הפגיעה בהן (פרנקו גלאור, 2025). המאבק הפמיניסטי של שלושים השנים האחרונות שינה חוקים ונהלים, אך לא את חוויית הנפגעות בהליך הפלילי, שמתמקד בנאשם ולא בהן. הספרות מכנה את המסע שהן עוברות בו "אונס שני": חוסר אמון, זלזול, פקפוק בחוויותיהן, והפיכתן לאובייקט כפי שנעשה להן בעת הפגיעה, כלומר קורבנות משנית (קלר-חלמיש ופלג-קוריאט, 2020: 37-38). מול זה עומדים צורכי הצדק וההחלמה של הנפגעות: תחושת ביטחון והטלת האחריות על הפוגע, קבלת תשובות, איחוי מערכות היחסים, ואיחוי תחושת העצמי והפסקת ההאשמה העצמית (קלר-חלמיש ופלג-קוריאט, 2020: 37).</w:t>
+        <w:t xml:space="preserve"> הוויקטימולוגיה הפמיניסטית, כפי שנלמדה בקורס, מבקשת לחשוף ולבקר את האופן שבו מוסדות חברתיים ומשפטיים מתייחסים לנפגעות, ולעיתים משעתקים את הפגיעה בהן. המאבק הפמיניסטי של שלושים השנים האחרונות שינה חוקים ונהלים, אך לא את חוויית הנפגעות בהליך הפלילי, שמתמקד בנאשם ולא בהן. הספרות מכנה את המסע שהן עוברות בו "אונס שני": חוסר אמון, זלזול, פקפוק בחוויותיהן, והפיכתן לאובייקט כפי שנעשה להן בעת הפגיעה, כלומר קורבנות משנית (קלר-חלמיש ופלג-קוריאט, 2020: 37-38). מול זה עומדים צורכי הצדק וההחלמה של הנפגעות: תחושת ביטחון והטלת האחריות על הפוגע, קבלת תשובות, איחוי מערכות היחסים, ואיחוי תחושת העצמי והפסקת ההאשמה העצמית (קלר-חלמיש ופלג-קוריאט, 2020: 37).</w:t>
       </w:r>
     </w:p>
     <w:p>
@@ -595,7 +595,7 @@
           <w:sz w:val="24"/>
           <w:szCs w:val="24"/>
         </w:rPr>
-        <w:t>התגובה החברתית לנפגע עצמו ממוגדרת אף היא. ניתוח של 1,890 תגובות גולשים לחשיפות של נפגעי פגיעה מינית במסגרת #MeToo בישראל מצא שרק 1.1% מהתגובות היו לא תומכות, אך נשים זכו לתמיכה רגשית ורשתית רבה יותר מגברים, ואילו גברים קיבלו יותר תמיכה מעריכה, דפוס המבטא סטריאוטיפים מגדריים (לוינשטיין-ברקאי, 2020). זו הסיבה שהגישה הפמיניסטית מתנגדת לדמות "הקורבן האידיאלי" ודורשת הכרה גם במי שאינו תואם אותה (פרנקו גלאור, 2025). אך גם צדק מאחה חשוד בעיניה, בשל מאפייניה הייחודיים של הפגיעה המינית: הבושה, הטאבו, הפגיעה הרגשית המוגברת, החשש לביטחון והפגיעה באמון הבסיסי, שכן רוב הפוגעים מוכרים לנפגעת. קלר-חלמיש ופלג-קוריאט (2020) טוענות שמחאת #MeToo חשפה את כישלון ההליך הפלילי, ולכן יש להנגיש צדק מאחה לפגיעות מיניות בתנאים מגוננים: וולונטריות מלאה לכל הצדדים, הכנה מעמיקה, מנחים בעלי מומחיות וקריטריונים ברורים להתאמת המקרה (עמ' 43-45). ממצאי הראיונות תומכים בעמדה זו. הנפגעות תיארו את ההליך כחוויה של החזרת שליטה ואוטונומיה, שכן הן מובילות אותו ומחליטות על כל פרט בו (הדר וגל, 2023: 369-370).</w:t>
+        <w:t>התגובה החברתית לנפגע עצמו ממוגדרת אף היא. ניתוח של 1,890 תגובות גולשים לחשיפות של נפגעי פגיעה מינית במסגרת #MeToo בישראל מצא שרק 1.1% מהתגובות היו לא תומכות, אך נשים זכו לתמיכה רגשית ורשתית רבה יותר מגברים, ואילו גברים קיבלו יותר תמיכה מעריכה, דפוס המבטא סטריאוטיפים מגדריים (לוינשטיין-ברקאי, 2020). זו הסיבה שהגישה הפמיניסטית מתנגדת לדמות "הקורבן האידיאלי" ודורשת הכרה גם במי שאינו תואם אותה. אך גם צדק מאחה חשוד בעיניה, בשל מאפייניה הייחודיים של הפגיעה המינית: הבושה, הטאבו, הפגיעה הרגשית המוגברת, החשש לביטחון והפגיעה באמון הבסיסי, שכן רוב הפוגעים מוכרים לנפגעת. קלר-חלמיש ופלג-קוריאט (2020) טוענות שמחאת #MeToo חשפה את כישלון ההליך הפלילי, ולכן יש להנגיש צדק מאחה לפגיעות מיניות בתנאים מגוננים: וולונטריות מלאה לכל הצדדים, הכנה מעמיקה, מנחים בעלי מומחיות וקריטריונים ברורים להתאמת המקרה (עמ' 43-45). ממצאי הראיונות תומכים בעמדה זו. הנפגעות תיארו את ההליך כחוויה של החזרת שליטה ואוטונומיה, שכן הן מובילות אותו ומחליטות על כל פרט בו (הדר וגל, 2023: 369-370).</w:t>
       </w:r>
     </w:p>
     <w:p>
@@ -831,7 +831,7 @@
           <w:sz w:val="24"/>
           <w:szCs w:val="24"/>
         </w:rPr>
-        <w:t>ההבדל הראשון הוא במעמד הטיעון. הקרימינולוגיה תיאורית ואמפירית, והיא בודקת מה ההליך עושה בפועל לנפגעות ולפוגעים (הדר וגל, 2023). היהדות נורמטיבית: היא אינה שואלת אם המפגש עובד אלא קובעת שהוא חובה. ההבדל השני, החריף יותר, נוגע לנפגע. הוויקטימולוגיה הפמיניסטית עומדת על וולונטריות מלאה (קלר-חלמיש ופלג-קוריאט, 2020), וכפי שנלמד בקורס, סליחה אינה יכולה להיות חובה מוסרית ואינה יכולה לבוא מבחוץ, אלא רק בקצב של הנפגעת, ובתרבויות של כבוד חובת הנקמה עשויה אף לגבור עליה (פרנקו גלאור, 2025). ההלכה, לעומת זאת, מכנה סרבן מחילה "אכזרי". הסתירה מתמתנת כשמבחינים בין הליך לעמדה מוסרית: ההלכה אינה כופה מפגש, מתירה לפוגע להניח לנפגע לאחר שלוש פניות, ומכוונת את תביעתה אל תודעת הנפגע ולא אל בית הדין. תרומת הקרימינולוגיה היא הזהירות, כלומר ידע אמפירי על פערי כוח ועל תנאי ההצלחה של המפגש. תרומת היהדות היא התביעה המוסרית: הפוגע חייב לעמוד מול מי שפגע בו, והנפגע אינו רק מושא להגנה אלא סובייקט מוסרי בעל אחריות.</w:t>
+        <w:t>ההבדל הראשון הוא במעמד הטיעון. הקרימינולוגיה תיאורית ואמפירית, והיא בודקת מה ההליך עושה בפועל לנפגעות ולפוגעים (הדר וגל, 2023). היהדות נורמטיבית: היא אינה שואלת אם המפגש עובד אלא קובעת שהוא חובה. ההבדל השני, החריף יותר, נוגע לנפגע. הוויקטימולוגיה הפמיניסטית עומדת על וולונטריות מלאה (קלר-חלמיש ופלג-קוריאט, 2020), וכפי שנלמד בקורס, סליחה אינה יכולה להיות חובה מוסרית ואינה יכולה לבוא מבחוץ, אלא רק בקצב של הנפגעת, ובתרבויות של כבוד חובת הנקמה עשויה אף לגבור עליה. ההלכה, לעומת זאת, מכנה סרבן מחילה "אכזרי". הסתירה מתמתנת כשמבחינים בין הליך לעמדה מוסרית: ההלכה אינה כופה מפגש, מתירה לפוגע להניח לנפגע לאחר שלוש פניות, ומכוונת את תביעתה אל תודעת הנפגע ולא אל בית הדין. תרומת הקרימינולוגיה היא הזהירות, כלומר ידע אמפירי על פערי כוח ועל תנאי ההצלחה של המפגש. תרומת היהדות היא התביעה המוסרית: הפוגע חייב לעמוד מול מי שפגע בו, והנפגע אינו רק מושא להגנה אלא סובייקט מוסרי בעל אחריות.</w:t>
       </w:r>
     </w:p>
     <w:p>
@@ -887,24 +887,6 @@
           <w:szCs w:val="24"/>
         </w:rPr>
         <w:t>לוינשטיין-ברקאי, ה' (2020). המגדר כן קובע? תמיכה חברתית בקורבנות-גברים של פגיעה מינית לעומת תמיכה בקורבנות-נשים ברשתות חברתיות בישראל. מגמות, נה(2), 167-190. https://info2011.szold.org.il/PDF-Articles/megamot/113341.pdf</w:t>
-      </w:r>
-    </w:p>
-    <w:p>
-      <w:pPr>
-        <w:spacing w:lineRule="auto" w:line="360" w:after="160" w:before="0"/>
-        <w:ind w:left="709" w:hanging="709"/>
-        <w:jc w:val="right"/>
-        <w:bidi w:val="1"/>
-      </w:pPr>
-      <w:r>
-        <w:rPr>
-          <w:rFonts w:ascii="David" w:hAnsi="David" w:cs="David" w:eastAsia="David"/>
-          <w:b w:val="0"/>
-          <w:i w:val="0"/>
-          <w:sz w:val="24"/>
-          <w:szCs w:val="24"/>
-        </w:rPr>
-        <w:t>פרנקו גלאור, ה' (2025). ויקטימולוגיה בראייה רב-תחומית: העבריין, אכיפת החוק והקורבן [מצגת הרצאה]. הקורס ויקטימולוגיה בראייה רב-תרבותית, הקריה האקדמית אונו.</w:t>
       </w:r>
     </w:p>
     <w:p>

</xml_diff>